<commit_message>
docs: complete chapter IV implementation testing and demo descriptions
</commit_message>
<xml_diff>
--- a/BÁO CÁO CUỐI KÌ.docx
+++ b/BÁO CÁO CUỐI KÌ.docx
@@ -33405,7 +33405,7 @@
     </w:p>
     <w:p>
       <w:r>
-        <w:t>This chapter describes the testing environment, testing approach, and selected test scenarios for the Restaurant and Food Order Management System. Testing focuses on the main functions that support customer activities and restaurant administration. The scenarios below provide sample test data and step-by-step procedures. Actual results should be recorded after executing each scenario against the current project build.</w:t>
+        <w:t xml:space="preserve">This chapter explains the implementation, verification approach and demonstration of the Restaurant and Food Order Management System on the Yamy branch. It describes the Windows application setup, automatic sample-data initialization, role-based workflows and selected functional test scenarios. Automated checks are reported separately from manual browser and SQL Server tests. The demonstration section describes the actual screens to capture; screenshots will be supplied by the project team.</w:t>
       </w:r>
     </w:p>
     <w:p>
@@ -33414,13 +33414,13 @@
       </w:pPr>
       <w:bookmarkStart w:id="134" w:name="_Toc244162480"/>
       <w:r>
-        <w:t>Testing Environment</w:t>
+        <w:t xml:space="preserve">Implementation Environment and Application Setup</w:t>
       </w:r>
       <w:bookmarkEnd w:id="134"/>
     </w:p>
     <w:p>
       <w:r>
-        <w:t>The application is developed as a web-based system using C#, ASP.NET MVC 5, and .NET Framework 4.8. Entity Framework 6 is used for database access, with Microsoft Microsoft SQL Server as the database server. Razor Views, HTML, CSS, Bootstrap, JavaScript, and jQuery support the user interface. Microsoft Visual Studio is used to build, run, and debug the application.</w:t>
+        <w:t xml:space="preserve">The application uses C#, ASP.NET MVC 5 and .NET Framework 4.8. Entity Framework 6.5.2 provides database access to Microsoft SQL Server. Razor Views, HTML, CSS, Bootstrap, JavaScript and jQuery implement the interface. Visual Studio with the ASP.NET and web development workload and the .NET Framework 4.8 Developer Pack is required for the intended Windows runtime. This chapter describes the current implementation; it does not claim that Windows end-to-end tests have been completed.</w:t>
       </w:r>
     </w:p>
     <w:p>
@@ -33498,6 +33498,8 @@
       <w:tr>
         <w:trPr>
           <w:jc w:val="center"/>
+          <w:cantSplit/>
+          <w:tblHeader/>
         </w:trPr>
         <w:tc>
           <w:tcPr>
@@ -33511,6 +33513,7 @@
                 <w:b/>
                 <w:sz w:val="26"/>
               </w:rPr>
+              <w:spacing w:before="0" w:after="40" w:line="276" w:lineRule="auto"/>
             </w:pPr>
             <w:r>
               <w:rPr>
@@ -33533,6 +33536,7 @@
                 <w:b/>
                 <w:sz w:val="26"/>
               </w:rPr>
+              <w:spacing w:before="0" w:after="40" w:line="276" w:lineRule="auto"/>
             </w:pPr>
             <w:r>
               <w:rPr>
@@ -33547,6 +33551,7 @@
       <w:tr>
         <w:trPr>
           <w:jc w:val="center"/>
+          <w:cantSplit/>
         </w:trPr>
         <w:tc>
           <w:tcPr>
@@ -33559,6 +33564,7 @@
               <w:rPr>
                 <w:sz w:val="26"/>
               </w:rPr>
+              <w:spacing w:before="0" w:after="40" w:line="276" w:lineRule="auto"/>
             </w:pPr>
             <w:r>
               <w:rPr>
@@ -33579,12 +33585,13 @@
               <w:rPr>
                 <w:sz w:val="26"/>
               </w:rPr>
-            </w:pPr>
-            <w:r>
-              <w:rPr>
-                <w:sz w:val="26"/>
-              </w:rPr>
-              <w:t xml:space="preserve"> RestaurantWebsite</w:t>
+              <w:spacing w:before="0" w:after="40" w:line="276" w:lineRule="auto"/>
+            </w:pPr>
+            <w:r>
+              <w:rPr>
+                <w:sz w:val="26"/>
+              </w:rPr>
+              <w:t xml:space="preserve">RestaurantWebsite, Yamy branch; application source at commit 364139a. The report was reviewed from repository commit 2c677fd.</w:t>
             </w:r>
           </w:p>
         </w:tc>
@@ -33592,6 +33599,7 @@
       <w:tr>
         <w:trPr>
           <w:jc w:val="center"/>
+          <w:cantSplit/>
         </w:trPr>
         <w:tc>
           <w:tcPr>
@@ -33604,6 +33612,7 @@
               <w:rPr>
                 <w:sz w:val="26"/>
               </w:rPr>
+              <w:spacing w:before="0" w:after="40" w:line="276" w:lineRule="auto"/>
             </w:pPr>
             <w:r>
               <w:rPr>
@@ -33624,12 +33633,13 @@
               <w:rPr>
                 <w:sz w:val="26"/>
               </w:rPr>
-            </w:pPr>
-            <w:r>
-              <w:rPr>
-                <w:sz w:val="26"/>
-              </w:rPr>
-              <w:t>https://github.com/chipcao1/RestaurantWebsite/tree/Yamy</w:t>
+              <w:spacing w:before="0" w:after="40" w:line="276" w:lineRule="auto"/>
+            </w:pPr>
+            <w:r>
+              <w:rPr>
+                <w:sz w:val="26"/>
+              </w:rPr>
+              <w:t xml:space="preserve">https://github.com/chipcao1/RestaurantWebsite/tree/Yamy</w:t>
             </w:r>
           </w:p>
         </w:tc>
@@ -33637,6 +33647,7 @@
       <w:tr>
         <w:trPr>
           <w:jc w:val="center"/>
+          <w:cantSplit/>
         </w:trPr>
         <w:tc>
           <w:tcPr>
@@ -33649,6 +33660,7 @@
               <w:rPr>
                 <w:sz w:val="26"/>
               </w:rPr>
+              <w:spacing w:before="0" w:after="40" w:line="276" w:lineRule="auto"/>
             </w:pPr>
             <w:r>
               <w:rPr>
@@ -33669,12 +33681,13 @@
               <w:rPr>
                 <w:sz w:val="26"/>
               </w:rPr>
-            </w:pPr>
-            <w:r>
-              <w:rPr>
-                <w:sz w:val="26"/>
-              </w:rPr>
-              <w:t>C#</w:t>
+              <w:spacing w:before="0" w:after="40" w:line="276" w:lineRule="auto"/>
+            </w:pPr>
+            <w:r>
+              <w:rPr>
+                <w:sz w:val="26"/>
+              </w:rPr>
+              <w:t xml:space="preserve">C#</w:t>
             </w:r>
           </w:p>
         </w:tc>
@@ -33682,6 +33695,7 @@
       <w:tr>
         <w:trPr>
           <w:jc w:val="center"/>
+          <w:cantSplit/>
         </w:trPr>
         <w:tc>
           <w:tcPr>
@@ -33694,6 +33708,7 @@
               <w:rPr>
                 <w:sz w:val="26"/>
               </w:rPr>
+              <w:spacing w:before="0" w:after="40" w:line="276" w:lineRule="auto"/>
             </w:pPr>
             <w:r>
               <w:rPr>
@@ -33714,12 +33729,13 @@
               <w:rPr>
                 <w:sz w:val="26"/>
               </w:rPr>
-            </w:pPr>
-            <w:r>
-              <w:rPr>
-                <w:sz w:val="26"/>
-              </w:rPr>
-              <w:t>ASP.NET MVC 5 / .NET Framework 4.8</w:t>
+              <w:spacing w:before="0" w:after="40" w:line="276" w:lineRule="auto"/>
+            </w:pPr>
+            <w:r>
+              <w:rPr>
+                <w:sz w:val="26"/>
+              </w:rPr>
+              <w:t xml:space="preserve">ASP.NET MVC 5 / .NET Framework 4.8; Windows and IIS Express for local execution.</w:t>
             </w:r>
           </w:p>
         </w:tc>
@@ -33727,6 +33743,7 @@
       <w:tr>
         <w:trPr>
           <w:jc w:val="center"/>
+          <w:cantSplit/>
         </w:trPr>
         <w:tc>
           <w:tcPr>
@@ -33739,6 +33756,7 @@
               <w:rPr>
                 <w:sz w:val="26"/>
               </w:rPr>
+              <w:spacing w:before="0" w:after="40" w:line="276" w:lineRule="auto"/>
             </w:pPr>
             <w:r>
               <w:rPr>
@@ -33759,12 +33777,13 @@
               <w:rPr>
                 <w:sz w:val="26"/>
               </w:rPr>
-            </w:pPr>
-            <w:r>
-              <w:rPr>
-                <w:sz w:val="26"/>
-              </w:rPr>
-              <w:t>Entity Framework 6</w:t>
+              <w:spacing w:before="0" w:after="40" w:line="276" w:lineRule="auto"/>
+            </w:pPr>
+            <w:r>
+              <w:rPr>
+                <w:sz w:val="26"/>
+              </w:rPr>
+              <w:t xml:space="preserve">Entity Framework 6.5.2, using the original InitialCreate migration.</w:t>
             </w:r>
           </w:p>
         </w:tc>
@@ -33772,6 +33791,7 @@
       <w:tr>
         <w:trPr>
           <w:jc w:val="center"/>
+          <w:cantSplit/>
         </w:trPr>
         <w:tc>
           <w:tcPr>
@@ -33784,6 +33804,7 @@
               <w:rPr>
                 <w:sz w:val="26"/>
               </w:rPr>
+              <w:spacing w:before="0" w:after="40" w:line="276" w:lineRule="auto"/>
             </w:pPr>
             <w:r>
               <w:rPr>
@@ -33804,12 +33825,13 @@
               <w:rPr>
                 <w:sz w:val="26"/>
               </w:rPr>
-            </w:pPr>
-            <w:r>
-              <w:rPr>
-                <w:sz w:val="26"/>
-              </w:rPr>
-              <w:t>Microsoft SQL Server</w:t>
+              <w:spacing w:before="0" w:after="40" w:line="276" w:lineRule="auto"/>
+            </w:pPr>
+            <w:r>
+              <w:rPr>
+                <w:sz w:val="26"/>
+              </w:rPr>
+              <w:t xml:space="preserve">Microsoft SQL Server; configure the RestaurantWebsite connection string in Web.config.</w:t>
             </w:r>
           </w:p>
         </w:tc>
@@ -33817,6 +33839,7 @@
       <w:tr>
         <w:trPr>
           <w:jc w:val="center"/>
+          <w:cantSplit/>
         </w:trPr>
         <w:tc>
           <w:tcPr>
@@ -33829,6 +33852,7 @@
               <w:rPr>
                 <w:sz w:val="26"/>
               </w:rPr>
+              <w:spacing w:before="0" w:after="40" w:line="276" w:lineRule="auto"/>
             </w:pPr>
             <w:r>
               <w:rPr>
@@ -33849,12 +33873,13 @@
               <w:rPr>
                 <w:sz w:val="26"/>
               </w:rPr>
-            </w:pPr>
-            <w:r>
-              <w:rPr>
-                <w:sz w:val="26"/>
-              </w:rPr>
-              <w:t>A modern browser such as Google Chrome or Microsoft Edge</w:t>
+              <w:spacing w:before="0" w:after="40" w:line="276" w:lineRule="auto"/>
+            </w:pPr>
+            <w:r>
+              <w:rPr>
+                <w:sz w:val="26"/>
+              </w:rPr>
+              <w:t xml:space="preserve">Planned manual browser coverage: Google Chrome or Microsoft Edge on Windows. Browser versions must be recorded during the actual test run.</w:t>
             </w:r>
           </w:p>
         </w:tc>
@@ -33862,6 +33887,7 @@
       <w:tr>
         <w:trPr>
           <w:jc w:val="center"/>
+          <w:cantSplit/>
         </w:trPr>
         <w:tc>
           <w:tcPr>
@@ -33874,6 +33900,7 @@
               <w:rPr>
                 <w:sz w:val="26"/>
               </w:rPr>
+              <w:spacing w:before="0" w:after="40" w:line="276" w:lineRule="auto"/>
             </w:pPr>
             <w:r>
               <w:rPr>
@@ -33894,19 +33921,20 @@
               <w:rPr>
                 <w:sz w:val="26"/>
               </w:rPr>
-            </w:pPr>
-            <w:r>
-              <w:rPr>
-                <w:sz w:val="26"/>
-              </w:rPr>
-              <w:t xml:space="preserve">Manual functional testing using sample records and role-specific </w:t>
+              <w:spacing w:before="0" w:after="40" w:line="276" w:lineRule="auto"/>
+            </w:pPr>
+            <w:r>
+              <w:rPr>
+                <w:sz w:val="26"/>
+              </w:rPr>
+              <w:t xml:space="preserve">Automated rule/helper checks and JavaScript regression suites; eight prepared manual functional scenarios using Customer, Staff and Admin accounts.</w:t>
             </w:r>
             <w:r>
               <w:rPr>
                 <w:sz w:val="26"/>
               </w:rPr>
               <w:lastRenderedPageBreak/>
-              <w:t>accounts</w:t>
+              <w:t/>
             </w:r>
           </w:p>
         </w:tc>
@@ -33914,6 +33942,85 @@
     </w:tbl>
     <w:p>
       <w:pPr>
+        <w:pStyle w:val="Heading3"/>
+      </w:pPr>
+      <w:r>
+        <w:t>Database Initialization and Sample Accounts</w:t>
+      </w:r>
+    </w:p>
+    <w:p>
+      <w:r>
+        <w:t>Open RestaurantWebsite.slnx in a compatible Visual Studio version, restore NuGet packages and set RestaurantWebsite as the startup project. Update the Data Source in Web.config to the SQL Server instance on the test computer. Build the application and run Update-Database in Package Manager Console with RestaurantWebsite selected as the default project.</w:t>
+      </w:r>
+    </w:p>
+    <w:p>
+      <w:r>
+        <w:t>Update-Database applies the original main-branch schema and automatically runs the seed embedded in the application assembly. Seed.sql inserts missing demonstration records, while UpdateFoodImages.sql replaces recognized legacy sample-image URLs. Re-running the command preserves existing passwords, edited prices and other existing record values; sample insertion relies on the documented record identifiers. No additional migration is required.</w:t>
+      </w:r>
+    </w:p>
+    <w:p>
+      <w:r>
+        <w:t>Alternatively, execute the root DATABASE.sql in SQL Server Management Studio. It creates RestaurantWebsite when necessary, applies the InitialCreate schema, records the corresponding EF6 migration history and inserts the same sample data. The script does not drop existing tables or databases. A database containing tables but no compatible migration history requires separate inspection rather than being assumed compatible.</w:t>
+      </w:r>
+    </w:p>
+    <w:p>
+      <w:r>
+        <w:t>The demonstration accounts are admin.yamy@example.test (Admin), staff.yamy@example.test (Staff), and khach1.yamy@example.test / khach2.yamy@example.test (Customer). Their initial sample password is YamyDemo@2026!. Existing sample accounts retain their previous passwords. These credentials are for demonstration and testing only.</w:t>
+      </w:r>
+    </w:p>
+    <w:p>
+      <w:pPr>
+        <w:pStyle w:val="Heading3"/>
+      </w:pPr>
+      <w:r>
+        <w:t>Implemented Structure and Role Workflows</w:t>
+      </w:r>
+    </w:p>
+    <w:p>
+      <w:r>
+        <w:t>The project retains the MVC 5 structure, with role-specific controllers and views under Areas/Customer, Areas/Staff and Areas/Admin. Shared services handle checkout quotations, promotions, table reservations and order-state changes. AppDbContext maps the existing relational schema, including dbo.Comboes. Custom authorization checks protect role-restricted actions and verify the current account rather than relying only on visible navigation links.</w:t>
+      </w:r>
+    </w:p>
+    <w:p>
+      <w:r>
+        <w:t>Visitors can browse the home-page preview and the full menu, filter categories and inspect dish details. The home page previews six matching results, while the menu provides the complete eligible catalogue. Ordering requires an active customer session; signed-out dish details do not expose quantity selection. Customers manage their carts, place orders, reserve tables and review their own order and reservation histories.</w:t>
+      </w:r>
+    </w:p>
+    <w:p>
+      <w:r>
+        <w:t>Login redirects each account to its designated role workspace. Staff process orders, record payment status, manage reservations and perform permitted catalogue operations; dish deletion is not exposed in the staff area. Administrators manage the catalogue, combos, promotions, reporting and accounts, and can switch between the administrator and staff workspaces while retaining the Admin role.</w:t>
+      </w:r>
+    </w:p>
+    <w:p>
+      <w:r>
+        <w:t>Administrator account management provides account viewing, password reset to 123456789, account locking/unlocking and staff-account creation. It does not provide unrestricted editing of another user’s profile. Passwords are handled by the application PasswordHasher with salted PBKDF2 for current hashes and compatibility handling for supported legacy hashes.</w:t>
+      </w:r>
+    </w:p>
+    <w:p>
+      <w:pPr>
+        <w:pStyle w:val="Heading3"/>
+      </w:pPr>
+      <w:r>
+        <w:t>Business Validation and Interface Behaviour</w:t>
+      </w:r>
+    </w:p>
+    <w:p>
+      <w:r>
+        <w:t>Checkout recalculates item prices and quantities from database records. Entering a promotion code requests an immediate preview and updates the summary with the code, discount description and monetary reduction. Final submission validates the promotion again before recording its usage. Supported order types are dine-in, takeaway and delivery; delivery requires a valid contact address.</w:t>
+      </w:r>
+    </w:p>
+    <w:p>
+      <w:r>
+        <w:t>An operator moves an order through Pending, Confirmed, Preparing and Ready. Completion is stored as Delivered and is allowed only after payment has been recorded as Completed. Cash, bank transfer and digital-wallet values are recorded by the application; choosing one does not by itself prove settlement through an external payment gateway.</w:t>
+      </w:r>
+    </w:p>
+    <w:p>
+      <w:r>
+        <w:t>Reservations require a future service time, an active available table and sufficient capacity. The service checks overlapping two-hour reservations and relevant open orders. Dish photographs use external URLs selected by dish name. Default combos display photographs of their actual component dishes; custom HTTPS combo images are retained. Internet access is therefore required for external photographs, with a local placeholder used when loading fails.</w:t>
+      </w:r>
+    </w:p>
+    <w:p>
+      <w:pPr>
         <w:pStyle w:val="Heading2"/>
       </w:pPr>
       <w:bookmarkStart w:id="137" w:name="_Toc244162481"/>
@@ -33925,12 +34032,12 @@
     </w:p>
     <w:p>
       <w:r>
-        <w:t>Manual functional testing is used to check whether the main user workflows behave according to the stated requirements. Each scenario specifies preconditions, test data, execution steps, and the expected result. Valid input is used to verify successful operations, while invalid or incomplete input is used where appropriate to check validation.</w:t>
-      </w:r>
-    </w:p>
-    <w:p>
-      <w:r>
-        <w:t>Before testing, run the application, confirm that the configured database can be reached, and prepare test accounts and sample menu data. The tester should record the actual outcome and mark each scenario as Pass or Fail. The results must reflect the behavior observed in the running application; expected results in this chapter are not a claim that the tests have already been executed.</w:t>
+        <w:t xml:space="preserve">Testing combines automated checks of isolated rules and frontend behaviour with prepared manual scenarios for the running MVC application. Each manual scenario specifies concrete data, preconditions, actions and expected outcomes. Positive and negative checks belong to the same workflow scenario and are not counted as separate completed scenarios. Tests should use a disposable copy of the database so that orders, reservations and account changes do not affect real users.</w:t>
+      </w:r>
+    </w:p>
+    <w:p>
+      <w:r>
+        <w:t xml:space="preserve">For this report update, the retained test harnesses were recovered into a temporary directory and executed against the current application source. All 74 rule/helper assertions and all four JavaScript regression suites passed. These checks cover selected calculations, transitions, filtering, promotion previews and image fallback behaviour. They do not execute IIS request handling, SQL Server persistence, login sessions or complete browser workflows. The eight manual scenarios below therefore remain Pending until executed on Windows with SQL Server.</w:t>
       </w:r>
     </w:p>
     <w:p>
@@ -33945,7 +34052,7 @@
     </w:p>
     <w:p>
       <w:r>
-        <w:t>The following scenarios cover the principal functions. Replace the sample values with records available in the local database when necessary. For account and administration tests, use accounts that have the required role assigned.</w:t>
+        <w:t xml:space="preserve">Run Update-Database or DATABASE.sql before manual testing. Use the sample accounts described above, confirm that their passwords and account states have not been changed, and verify current dish prices. The values below assume unchanged sample data. Record the actual browser and SQL Server versions, the observed outcome and any error message when running each scenario. A prepared expected result is not evidence of a successful execution.</w:t>
       </w:r>
     </w:p>
     <w:p>
@@ -34039,6 +34146,8 @@
       <w:tr>
         <w:trPr>
           <w:jc w:val="center"/>
+          <w:cantSplit/>
+          <w:tblHeader/>
         </w:trPr>
         <w:tc>
           <w:tcPr>
@@ -34052,6 +34161,7 @@
                 <w:b/>
                 <w:sz w:val="26"/>
               </w:rPr>
+              <w:spacing w:before="0" w:after="40" w:line="276" w:lineRule="auto"/>
             </w:pPr>
             <w:r>
               <w:rPr>
@@ -34074,6 +34184,7 @@
                 <w:b/>
                 <w:sz w:val="26"/>
               </w:rPr>
+              <w:spacing w:before="0" w:after="40" w:line="276" w:lineRule="auto"/>
             </w:pPr>
             <w:r>
               <w:rPr>
@@ -34088,6 +34199,7 @@
       <w:tr>
         <w:trPr>
           <w:jc w:val="center"/>
+          <w:cantSplit/>
         </w:trPr>
         <w:tc>
           <w:tcPr>
@@ -34100,6 +34212,7 @@
               <w:rPr>
                 <w:sz w:val="26"/>
               </w:rPr>
+              <w:spacing w:before="0" w:after="40" w:line="276" w:lineRule="auto"/>
             </w:pPr>
             <w:r>
               <w:rPr>
@@ -34120,36 +34233,37 @@
               <w:rPr>
                 <w:sz w:val="26"/>
               </w:rPr>
-            </w:pPr>
-            <w:r>
-              <w:rPr>
-                <w:sz w:val="26"/>
-              </w:rPr>
-              <w:t xml:space="preserve">Name: Test Customer; Email: </w:t>
-            </w:r>
-            <w:r>
-              <w:rPr>
-                <w:sz w:val="26"/>
-              </w:rPr>
-              <w:t>customer@gmail.com</w:t>
-            </w:r>
-            <w:r>
-              <w:rPr>
-                <w:sz w:val="26"/>
-              </w:rPr>
-              <w:t xml:space="preserve">; Password: </w:t>
-            </w:r>
-            <w:r>
-              <w:rPr>
-                <w:sz w:val="26"/>
-              </w:rPr>
-              <w:t>123456</w:t>
-            </w:r>
-            <w:r>
-              <w:rPr>
-                <w:sz w:val="26"/>
-              </w:rPr>
-              <w:t>. For login, use the account created during registration.</w:t>
+              <w:spacing w:before="0" w:after="40" w:line="276" w:lineRule="auto"/>
+            </w:pPr>
+            <w:r>
+              <w:rPr>
+                <w:sz w:val="26"/>
+              </w:rPr>
+              <w:t xml:space="preserve">Full name: Test Customer; email: testing.customer@example.test; password and confirmation: Test@2026!; phone: 0901234567. Invalid variants: duplicate email, mismatched confirmation and incorrect login password.</w:t>
+            </w:r>
+            <w:r>
+              <w:rPr>
+                <w:sz w:val="26"/>
+              </w:rPr>
+              <w:t/>
+            </w:r>
+            <w:r>
+              <w:rPr>
+                <w:sz w:val="26"/>
+              </w:rPr>
+              <w:t xml:space="preserve"/>
+            </w:r>
+            <w:r>
+              <w:rPr>
+                <w:sz w:val="26"/>
+              </w:rPr>
+              <w:t/>
+            </w:r>
+            <w:r>
+              <w:rPr>
+                <w:sz w:val="26"/>
+              </w:rPr>
+              <w:t/>
             </w:r>
           </w:p>
         </w:tc>
@@ -34157,6 +34271,7 @@
       <w:tr>
         <w:trPr>
           <w:jc w:val="center"/>
+          <w:cantSplit/>
         </w:trPr>
         <w:tc>
           <w:tcPr>
@@ -34169,6 +34284,7 @@
               <w:rPr>
                 <w:sz w:val="26"/>
               </w:rPr>
+              <w:spacing w:before="0" w:after="40" w:line="276" w:lineRule="auto"/>
             </w:pPr>
             <w:r>
               <w:rPr>
@@ -34189,12 +34305,13 @@
               <w:rPr>
                 <w:sz w:val="26"/>
               </w:rPr>
-            </w:pPr>
-            <w:r>
-              <w:rPr>
-                <w:sz w:val="26"/>
-              </w:rPr>
-              <w:t>The email address has not already been registered. The application is running.</w:t>
+              <w:spacing w:before="0" w:after="40" w:line="276" w:lineRule="auto"/>
+            </w:pPr>
+            <w:r>
+              <w:rPr>
+                <w:sz w:val="26"/>
+              </w:rPr>
+              <w:t xml:space="preserve">The application and database are available. The registration email is unused; the browser is signed out.</w:t>
             </w:r>
           </w:p>
         </w:tc>
@@ -34202,6 +34319,7 @@
       <w:tr>
         <w:trPr>
           <w:jc w:val="center"/>
+          <w:cantSplit/>
         </w:trPr>
         <w:tc>
           <w:tcPr>
@@ -34214,6 +34332,7 @@
               <w:rPr>
                 <w:sz w:val="26"/>
               </w:rPr>
+              <w:spacing w:before="0" w:after="40" w:line="276" w:lineRule="auto"/>
             </w:pPr>
             <w:r>
               <w:rPr>
@@ -34234,19 +34353,20 @@
               <w:rPr>
                 <w:sz w:val="26"/>
               </w:rPr>
-            </w:pPr>
-            <w:r>
-              <w:rPr>
-                <w:sz w:val="26"/>
-              </w:rPr>
-              <w:t xml:space="preserve">1. Open the registration page. 2. Enter the sample name, email, and password. 3. Submit the form. 4. Open the login page. 5. Enter the registered email and password. 6. Submit the login </w:t>
+              <w:spacing w:before="0" w:after="40" w:line="276" w:lineRule="auto"/>
+            </w:pPr>
+            <w:r>
+              <w:rPr>
+                <w:sz w:val="26"/>
+              </w:rPr>
+              <w:t xml:space="preserve">1. Register using the valid data. 2. Sign in with the new credentials. 3. Verify the customer home destination. 4. Sign out and attempt an incorrect password. 5. Try registering the same email again and a separate attempt with mismatched passwords.</w:t>
             </w:r>
             <w:r>
               <w:rPr>
                 <w:sz w:val="26"/>
               </w:rPr>
               <w:lastRenderedPageBreak/>
-              <w:t>form.</w:t>
+              <w:t/>
             </w:r>
           </w:p>
         </w:tc>
@@ -34254,6 +34374,7 @@
       <w:tr>
         <w:trPr>
           <w:jc w:val="center"/>
+          <w:cantSplit/>
         </w:trPr>
         <w:tc>
           <w:tcPr>
@@ -34266,6 +34387,7 @@
               <w:rPr>
                 <w:sz w:val="26"/>
               </w:rPr>
+              <w:spacing w:before="0" w:after="40" w:line="276" w:lineRule="auto"/>
             </w:pPr>
             <w:r>
               <w:rPr>
@@ -34287,12 +34409,13 @@
               <w:rPr>
                 <w:sz w:val="26"/>
               </w:rPr>
-            </w:pPr>
-            <w:r>
-              <w:rPr>
-                <w:sz w:val="26"/>
-              </w:rPr>
-              <w:t>The system validates the input and creates the account if the data is valid. The customer can then log in and is redirected to an appropriate page. Invalid or incorrect credentials should not grant access.</w:t>
+              <w:spacing w:before="0" w:after="40" w:line="276" w:lineRule="auto"/>
+            </w:pPr>
+            <w:r>
+              <w:rPr>
+                <w:sz w:val="26"/>
+              </w:rPr>
+              <w:t xml:space="preserve">A valid registration creates an active Customer account. Valid login opens the customer workspace. Wrong credentials are rejected. Duplicate email and mismatched confirmation produce validation messages without creating another account.</w:t>
             </w:r>
           </w:p>
         </w:tc>
@@ -34300,6 +34423,7 @@
       <w:tr>
         <w:trPr>
           <w:jc w:val="center"/>
+          <w:cantSplit/>
         </w:trPr>
         <w:tc>
           <w:tcPr>
@@ -34312,6 +34436,7 @@
               <w:rPr>
                 <w:sz w:val="26"/>
               </w:rPr>
+              <w:spacing w:before="0" w:after="40" w:line="276" w:lineRule="auto"/>
             </w:pPr>
             <w:r>
               <w:rPr>
@@ -34332,12 +34457,13 @@
               <w:rPr>
                 <w:sz w:val="26"/>
               </w:rPr>
-            </w:pPr>
-            <w:r>
-              <w:rPr>
-                <w:sz w:val="26"/>
-              </w:rPr>
-              <w:t>Record the observed result: ____________________  Pass / Fail: __________</w:t>
+              <w:spacing w:before="0" w:after="40" w:line="276" w:lineRule="auto"/>
+            </w:pPr>
+            <w:r>
+              <w:rPr>
+                <w:sz w:val="26"/>
+              </w:rPr>
+              <w:t xml:space="preserve">Status: Pending manual execution. Registration, credential verification, persistence and role-home redirection have been inspected in source but have not been observed together in a running Windows/IIS session.</w:t>
             </w:r>
           </w:p>
         </w:tc>
@@ -34435,6 +34561,8 @@
       <w:tr>
         <w:trPr>
           <w:jc w:val="center"/>
+          <w:cantSplit/>
+          <w:tblHeader/>
         </w:trPr>
         <w:tc>
           <w:tcPr>
@@ -34448,6 +34576,7 @@
                 <w:b/>
                 <w:sz w:val="26"/>
               </w:rPr>
+              <w:spacing w:before="0" w:after="40" w:line="276" w:lineRule="auto"/>
             </w:pPr>
             <w:r>
               <w:rPr>
@@ -34470,6 +34599,7 @@
                 <w:b/>
                 <w:sz w:val="26"/>
               </w:rPr>
+              <w:spacing w:before="0" w:after="40" w:line="276" w:lineRule="auto"/>
             </w:pPr>
             <w:r>
               <w:rPr>
@@ -34484,6 +34614,7 @@
       <w:tr>
         <w:trPr>
           <w:jc w:val="center"/>
+          <w:cantSplit/>
         </w:trPr>
         <w:tc>
           <w:tcPr>
@@ -34496,6 +34627,7 @@
               <w:rPr>
                 <w:sz w:val="26"/>
               </w:rPr>
+              <w:spacing w:before="0" w:after="40" w:line="276" w:lineRule="auto"/>
             </w:pPr>
             <w:r>
               <w:rPr>
@@ -34516,12 +34648,13 @@
               <w:rPr>
                 <w:sz w:val="26"/>
               </w:rPr>
-            </w:pPr>
-            <w:r>
-              <w:rPr>
-                <w:sz w:val="26"/>
-              </w:rPr>
-              <w:t>An active category, for example “Main Dishes”; an active dish, for example “Grilled Chicken”; a valid displayed price and description.</w:t>
+              <w:spacing w:before="0" w:after="40" w:line="276" w:lineRule="auto"/>
+            </w:pPr>
+            <w:r>
+              <w:rPr>
+                <w:sz w:val="26"/>
+              </w:rPr>
+              <w:t xml:space="preserve">Category: Món chính; dish: Gà nướng thảo mộc; sample unit price: VND 99,000. Also inspect a component-based combo and the home-page preview.</w:t>
             </w:r>
           </w:p>
         </w:tc>
@@ -34529,6 +34662,7 @@
       <w:tr>
         <w:trPr>
           <w:jc w:val="center"/>
+          <w:cantSplit/>
         </w:trPr>
         <w:tc>
           <w:tcPr>
@@ -34541,6 +34675,7 @@
               <w:rPr>
                 <w:sz w:val="26"/>
               </w:rPr>
+              <w:spacing w:before="0" w:after="40" w:line="276" w:lineRule="auto"/>
             </w:pPr>
             <w:r>
               <w:rPr>
@@ -34561,12 +34696,13 @@
               <w:rPr>
                 <w:sz w:val="26"/>
               </w:rPr>
-            </w:pPr>
-            <w:r>
-              <w:rPr>
-                <w:sz w:val="26"/>
-              </w:rPr>
-              <w:t>At least one active category and dish exist in the database.</w:t>
+              <w:spacing w:before="0" w:after="40" w:line="276" w:lineRule="auto"/>
+            </w:pPr>
+            <w:r>
+              <w:rPr>
+                <w:sz w:val="26"/>
+              </w:rPr>
+              <w:t xml:space="preserve">Sample data exists. The category is active and the dish is Available. The visitor is signed out; external-image access is available.</w:t>
             </w:r>
           </w:p>
         </w:tc>
@@ -34574,6 +34710,7 @@
       <w:tr>
         <w:trPr>
           <w:jc w:val="center"/>
+          <w:cantSplit/>
         </w:trPr>
         <w:tc>
           <w:tcPr>
@@ -34586,6 +34723,7 @@
               <w:rPr>
                 <w:sz w:val="26"/>
               </w:rPr>
+              <w:spacing w:before="0" w:after="40" w:line="276" w:lineRule="auto"/>
             </w:pPr>
             <w:r>
               <w:rPr>
@@ -34606,12 +34744,13 @@
               <w:rPr>
                 <w:sz w:val="26"/>
               </w:rPr>
-            </w:pPr>
-            <w:r>
-              <w:rPr>
-                <w:sz w:val="26"/>
-              </w:rPr>
-              <w:t>1. Open the public menu page. 2. Browse or select a category. 3. Select a dish. 4. Review its name, description, price, and image if provided.</w:t>
+              <w:spacing w:before="0" w:after="40" w:line="276" w:lineRule="auto"/>
+            </w:pPr>
+            <w:r>
+              <w:rPr>
+                <w:sz w:val="26"/>
+              </w:rPr>
+              <w:t xml:space="preserve">1. Open Home and review its preview. 2. Open the full menu. 3. Filter Món chính and search for Gà nướng thảo mộc. 4. Open its details. 5. Inspect a combo. 6. Check that signed-out dish details have no quantity selector.</w:t>
             </w:r>
           </w:p>
         </w:tc>
@@ -34619,6 +34758,7 @@
       <w:tr>
         <w:trPr>
           <w:jc w:val="center"/>
+          <w:cantSplit/>
         </w:trPr>
         <w:tc>
           <w:tcPr>
@@ -34631,6 +34771,7 @@
               <w:rPr>
                 <w:sz w:val="26"/>
               </w:rPr>
+              <w:spacing w:before="0" w:after="40" w:line="276" w:lineRule="auto"/>
             </w:pPr>
             <w:r>
               <w:rPr>
@@ -34651,12 +34792,13 @@
               <w:rPr>
                 <w:sz w:val="26"/>
               </w:rPr>
-            </w:pPr>
-            <w:r>
-              <w:rPr>
-                <w:sz w:val="26"/>
-              </w:rPr>
-              <w:t>The menu displays available items and their information. The detail page shows the selected dish rather than unrelated or missing data.</w:t>
+              <w:spacing w:before="0" w:after="40" w:line="276" w:lineRule="auto"/>
+            </w:pPr>
+            <w:r>
+              <w:rPr>
+                <w:sz w:val="26"/>
+              </w:rPr>
+              <w:t xml:space="preserve">Home previews up to six matching results; the full menu retains all eligible records. Filters and search select the correct items. Dish details show matching information and the current database price. Default combos show component images. Signed-out users cannot select ordering quantities.</w:t>
             </w:r>
           </w:p>
         </w:tc>
@@ -34664,6 +34806,7 @@
       <w:tr>
         <w:trPr>
           <w:jc w:val="center"/>
+          <w:cantSplit/>
         </w:trPr>
         <w:tc>
           <w:tcPr>
@@ -34676,6 +34819,7 @@
               <w:rPr>
                 <w:sz w:val="26"/>
               </w:rPr>
+              <w:spacing w:before="0" w:after="40" w:line="276" w:lineRule="auto"/>
             </w:pPr>
             <w:r>
               <w:rPr>
@@ -34696,12 +34840,13 @@
               <w:rPr>
                 <w:sz w:val="26"/>
               </w:rPr>
-            </w:pPr>
-            <w:r>
-              <w:rPr>
-                <w:sz w:val="26"/>
-              </w:rPr>
-              <w:t>Record the observed result: ____________________  Pass / Fail: __________</w:t>
+              <w:spacing w:before="0" w:after="40" w:line="276" w:lineRule="auto"/>
+            </w:pPr>
+            <w:r>
+              <w:rPr>
+                <w:sz w:val="26"/>
+              </w:rPr>
+              <w:t xml:space="preserve">Status: Pending manual execution. Automated catalogue-filtering and image-fallback suites passed, but SQL-backed catalogue rendering, guest controls and real external-image loading still require browser verification.</w:t>
             </w:r>
           </w:p>
         </w:tc>
@@ -34799,6 +34944,8 @@
       <w:tr>
         <w:trPr>
           <w:jc w:val="center"/>
+          <w:cantSplit/>
+          <w:tblHeader/>
         </w:trPr>
         <w:tc>
           <w:tcPr>
@@ -34812,6 +34959,7 @@
                 <w:b/>
                 <w:sz w:val="26"/>
               </w:rPr>
+              <w:spacing w:before="0" w:after="40" w:line="276" w:lineRule="auto"/>
             </w:pPr>
             <w:r>
               <w:rPr>
@@ -34834,6 +34982,7 @@
                 <w:b/>
                 <w:sz w:val="26"/>
               </w:rPr>
+              <w:spacing w:before="0" w:after="40" w:line="276" w:lineRule="auto"/>
             </w:pPr>
             <w:r>
               <w:rPr>
@@ -34848,6 +34997,7 @@
       <w:tr>
         <w:trPr>
           <w:jc w:val="center"/>
+          <w:cantSplit/>
         </w:trPr>
         <w:tc>
           <w:tcPr>
@@ -34860,6 +35010,7 @@
               <w:rPr>
                 <w:sz w:val="26"/>
               </w:rPr>
+              <w:spacing w:before="0" w:after="40" w:line="276" w:lineRule="auto"/>
             </w:pPr>
             <w:r>
               <w:rPr>
@@ -34881,12 +35032,13 @@
               <w:rPr>
                 <w:sz w:val="26"/>
               </w:rPr>
-            </w:pPr>
-            <w:r>
-              <w:rPr>
-                <w:sz w:val="26"/>
-              </w:rPr>
-              <w:t>Dish: Grilled Chicken; quantity: 2; use the price displayed by the application.</w:t>
+              <w:spacing w:before="0" w:after="40" w:line="276" w:lineRule="auto"/>
+            </w:pPr>
+            <w:r>
+              <w:rPr>
+                <w:sz w:val="26"/>
+              </w:rPr>
+              <w:t xml:space="preserve">Customer: khach1.yamy@example.test / YamyDemo@2026!; dish: Gà nướng thảo mộc; quantities: 1 then 2. At VND 99,000 per serving, two servings total VND 198,000.</w:t>
             </w:r>
           </w:p>
         </w:tc>
@@ -34894,6 +35046,7 @@
       <w:tr>
         <w:trPr>
           <w:jc w:val="center"/>
+          <w:cantSplit/>
         </w:trPr>
         <w:tc>
           <w:tcPr>
@@ -34906,6 +35059,7 @@
               <w:rPr>
                 <w:sz w:val="26"/>
               </w:rPr>
+              <w:spacing w:before="0" w:after="40" w:line="276" w:lineRule="auto"/>
             </w:pPr>
             <w:r>
               <w:rPr>
@@ -34926,12 +35080,13 @@
               <w:rPr>
                 <w:sz w:val="26"/>
               </w:rPr>
-            </w:pPr>
-            <w:r>
-              <w:rPr>
-                <w:sz w:val="26"/>
-              </w:rPr>
-              <w:t>A customer can access the menu and the selected dish is available for ordering.</w:t>
+              <w:spacing w:before="0" w:after="40" w:line="276" w:lineRule="auto"/>
+            </w:pPr>
+            <w:r>
+              <w:rPr>
+                <w:sz w:val="26"/>
+              </w:rPr>
+              <w:t xml:space="preserve">The sample customer is active and signed in. The dish is available and the cart is initially empty.</w:t>
             </w:r>
           </w:p>
         </w:tc>
@@ -34939,6 +35094,7 @@
       <w:tr>
         <w:trPr>
           <w:jc w:val="center"/>
+          <w:cantSplit/>
         </w:trPr>
         <w:tc>
           <w:tcPr>
@@ -34951,6 +35107,7 @@
               <w:rPr>
                 <w:sz w:val="26"/>
               </w:rPr>
+              <w:spacing w:before="0" w:after="40" w:line="276" w:lineRule="auto"/>
             </w:pPr>
             <w:r>
               <w:rPr>
@@ -34971,12 +35128,13 @@
               <w:rPr>
                 <w:sz w:val="26"/>
               </w:rPr>
-            </w:pPr>
-            <w:r>
-              <w:rPr>
-                <w:sz w:val="26"/>
-              </w:rPr>
-              <w:t>1. Open the dish or menu listing. 2. Add the dish to the cart. 3. Open the cart. 4. Change the quantity to 2, if quantity editing is supported. 5. Review the item subtotal and cart total.</w:t>
+              <w:spacing w:before="0" w:after="40" w:line="276" w:lineRule="auto"/>
+            </w:pPr>
+            <w:r>
+              <w:rPr>
+                <w:sz w:val="26"/>
+              </w:rPr>
+              <w:t xml:space="preserve">1. Open the dish details and add one serving. 2. Open the cart. 3. Change its quantity to 2. 4. Review line and cart totals. 5. Refresh or revisit the cart. 6. Remove the item and review the empty cart.</w:t>
             </w:r>
           </w:p>
         </w:tc>
@@ -34984,6 +35142,7 @@
       <w:tr>
         <w:trPr>
           <w:jc w:val="center"/>
+          <w:cantSplit/>
         </w:trPr>
         <w:tc>
           <w:tcPr>
@@ -34996,6 +35155,7 @@
               <w:rPr>
                 <w:sz w:val="26"/>
               </w:rPr>
+              <w:spacing w:before="0" w:after="40" w:line="276" w:lineRule="auto"/>
             </w:pPr>
             <w:r>
               <w:rPr>
@@ -35016,12 +35176,13 @@
               <w:rPr>
                 <w:sz w:val="26"/>
               </w:rPr>
-            </w:pPr>
-            <w:r>
-              <w:rPr>
-                <w:sz w:val="26"/>
-              </w:rPr>
-              <w:t>The selected dish appears in the cart. The quantity and total are updated consistently with the displayed unit price. Removing an item, if available, removes it from the cart.</w:t>
+              <w:spacing w:before="0" w:after="40" w:line="276" w:lineRule="auto"/>
+            </w:pPr>
+            <w:r>
+              <w:rPr>
+                <w:sz w:val="26"/>
+              </w:rPr>
+              <w:t xml:space="preserve">The correct dish is added. Quantity 2 produces twice the current unit price. Revisiting the cart preserves the applicable cart state. Removing the item removes its contribution from the total and displays an appropriate empty-cart state.</w:t>
             </w:r>
           </w:p>
         </w:tc>
@@ -35029,6 +35190,7 @@
       <w:tr>
         <w:trPr>
           <w:jc w:val="center"/>
+          <w:cantSplit/>
         </w:trPr>
         <w:tc>
           <w:tcPr>
@@ -35041,6 +35203,7 @@
               <w:rPr>
                 <w:sz w:val="26"/>
               </w:rPr>
+              <w:spacing w:before="0" w:after="40" w:line="276" w:lineRule="auto"/>
             </w:pPr>
             <w:r>
               <w:rPr>
@@ -35061,12 +35224,13 @@
               <w:rPr>
                 <w:sz w:val="26"/>
               </w:rPr>
-            </w:pPr>
-            <w:r>
-              <w:rPr>
-                <w:sz w:val="26"/>
-              </w:rPr>
-              <w:t>Record the observed result: ____________________  Pass / Fail: __________</w:t>
+              <w:spacing w:before="0" w:after="40" w:line="276" w:lineRule="auto"/>
+            </w:pPr>
+            <w:r>
+              <w:rPr>
+                <w:sz w:val="26"/>
+              </w:rPr>
+              <w:t xml:space="preserve">Status: Pending manual execution. The complete session-based add/update/remove workflow and displayed cart totals have not been executed against the Windows application.</w:t>
             </w:r>
           </w:p>
         </w:tc>
@@ -35161,6 +35325,8 @@
       <w:tr>
         <w:trPr>
           <w:jc w:val="center"/>
+          <w:cantSplit/>
+          <w:tblHeader/>
         </w:trPr>
         <w:tc>
           <w:tcPr>
@@ -35174,6 +35340,7 @@
                 <w:b/>
                 <w:sz w:val="26"/>
               </w:rPr>
+              <w:spacing w:before="0" w:after="40" w:line="276" w:lineRule="auto"/>
             </w:pPr>
             <w:r>
               <w:rPr>
@@ -35196,6 +35363,7 @@
                 <w:b/>
                 <w:sz w:val="26"/>
               </w:rPr>
+              <w:spacing w:before="0" w:after="40" w:line="276" w:lineRule="auto"/>
             </w:pPr>
             <w:r>
               <w:rPr>
@@ -35210,6 +35378,7 @@
       <w:tr>
         <w:trPr>
           <w:jc w:val="center"/>
+          <w:cantSplit/>
         </w:trPr>
         <w:tc>
           <w:tcPr>
@@ -35222,6 +35391,7 @@
               <w:rPr>
                 <w:sz w:val="26"/>
               </w:rPr>
+              <w:spacing w:before="0" w:after="40" w:line="276" w:lineRule="auto"/>
             </w:pPr>
             <w:r>
               <w:rPr>
@@ -35242,12 +35412,13 @@
               <w:rPr>
                 <w:sz w:val="26"/>
               </w:rPr>
-            </w:pPr>
-            <w:r>
-              <w:rPr>
-                <w:sz w:val="26"/>
-              </w:rPr>
-              <w:t>A cart containing one or more available dishes; order type: choose one supported option (Dine-in, Takeaway, or Delivery); payment method: choose one option shown by the application; delivery/contact details where required.</w:t>
+              <w:spacing w:before="0" w:after="40" w:line="276" w:lineRule="auto"/>
+            </w:pPr>
+            <w:r>
+              <w:rPr>
+                <w:sz w:val="26"/>
+              </w:rPr>
+              <w:t xml:space="preserve">Customer: khach1.yamy@example.test; cart: 2 × Gà nướng thảo mộc; order type: Takeaway; payment: Cash; phone: 0901234567. Promotion: YM10 when active and eligible; invalid variant: NO_SUCH_CODE.</w:t>
             </w:r>
           </w:p>
         </w:tc>
@@ -35255,6 +35426,7 @@
       <w:tr>
         <w:trPr>
           <w:jc w:val="center"/>
+          <w:cantSplit/>
         </w:trPr>
         <w:tc>
           <w:tcPr>
@@ -35267,6 +35439,7 @@
               <w:rPr>
                 <w:sz w:val="26"/>
               </w:rPr>
+              <w:spacing w:before="0" w:after="40" w:line="276" w:lineRule="auto"/>
             </w:pPr>
             <w:r>
               <w:rPr>
@@ -35287,12 +35460,13 @@
               <w:rPr>
                 <w:sz w:val="26"/>
               </w:rPr>
-            </w:pPr>
-            <w:r>
-              <w:rPr>
-                <w:sz w:val="26"/>
-              </w:rPr>
-              <w:t>The customer has items in the cart and has signed in if checkout requires authentication.</w:t>
+              <w:spacing w:before="0" w:after="40" w:line="276" w:lineRule="auto"/>
+            </w:pPr>
+            <w:r>
+              <w:rPr>
+                <w:sz w:val="26"/>
+              </w:rPr>
+              <w:t xml:space="preserve">The customer is signed in and the cart contains available dishes. YM10 is active, within its dates and usage limit, and the subtotal meets its minimum. Restore the promotion’s original state after testing.</w:t>
             </w:r>
           </w:p>
         </w:tc>
@@ -35300,6 +35474,7 @@
       <w:tr>
         <w:trPr>
           <w:jc w:val="center"/>
+          <w:cantSplit/>
         </w:trPr>
         <w:tc>
           <w:tcPr>
@@ -35312,6 +35487,7 @@
               <w:rPr>
                 <w:sz w:val="26"/>
               </w:rPr>
+              <w:spacing w:before="0" w:after="40" w:line="276" w:lineRule="auto"/>
             </w:pPr>
             <w:r>
               <w:rPr>
@@ -35332,12 +35508,13 @@
               <w:rPr>
                 <w:sz w:val="26"/>
               </w:rPr>
-            </w:pPr>
-            <w:r>
-              <w:rPr>
-                <w:sz w:val="26"/>
-              </w:rPr>
-              <w:t>1. Open the cart. 2. Proceed to checkout. 3. Select an available order type. 4. Enter required customer, table, or delivery information. 5. Select a payment method displayed by the application. 6. Review the order summary. 7. Submit the order. 8. Open the order history or order confirmation page.</w:t>
+              <w:spacing w:before="0" w:after="40" w:line="276" w:lineRule="auto"/>
+            </w:pPr>
+            <w:r>
+              <w:rPr>
+                <w:sz w:val="26"/>
+              </w:rPr>
+              <w:t xml:space="preserve">1. Open checkout. 2. Choose Takeaway, Cash and the contact phone. 3. Enter YM10 and inspect the immediate summary. 4. Enter NO_SUCH_CODE and check rejection. 5. Restore YM10 and submit once. 6. Inspect the order details/history and verify the cart state.</w:t>
             </w:r>
           </w:p>
         </w:tc>
@@ -35345,6 +35522,7 @@
       <w:tr>
         <w:trPr>
           <w:jc w:val="center"/>
+          <w:cantSplit/>
         </w:trPr>
         <w:tc>
           <w:tcPr>
@@ -35357,6 +35535,7 @@
               <w:rPr>
                 <w:sz w:val="26"/>
               </w:rPr>
+              <w:spacing w:before="0" w:after="40" w:line="276" w:lineRule="auto"/>
             </w:pPr>
             <w:r>
               <w:rPr>
@@ -35377,19 +35556,20 @@
               <w:rPr>
                 <w:sz w:val="26"/>
               </w:rPr>
-            </w:pPr>
-            <w:r>
-              <w:rPr>
-                <w:sz w:val="26"/>
-              </w:rPr>
-              <w:t xml:space="preserve">The system validates required fields and creates an order when </w:t>
+              <w:spacing w:before="0" w:after="40" w:line="276" w:lineRule="auto"/>
+            </w:pPr>
+            <w:r>
+              <w:rPr>
+                <w:sz w:val="26"/>
+              </w:rPr>
+              <w:t xml:space="preserve">At the sample subtotal of VND 198,000, YM10 gives a 10% discount of VND 19,800 and a total of VND 178,200, with no delivery fee. The preview identifies the code and discount. An invalid code is rejected. Submission revalidates the data and creates a Pending order with a pending cash payment; the order is visible to its owner.</w:t>
             </w:r>
             <w:r>
               <w:rPr>
                 <w:sz w:val="26"/>
               </w:rPr>
               <w:lastRenderedPageBreak/>
-              <w:t>the information is valid. The order summary should reflect the selected items and applicable totals. The newly created order should be visible in the relevant confirmation or order-history view.</w:t>
+              <w:t/>
             </w:r>
           </w:p>
         </w:tc>
@@ -35397,6 +35577,7 @@
       <w:tr>
         <w:trPr>
           <w:jc w:val="center"/>
+          <w:cantSplit/>
         </w:trPr>
         <w:tc>
           <w:tcPr>
@@ -35409,6 +35590,7 @@
               <w:rPr>
                 <w:sz w:val="26"/>
               </w:rPr>
+              <w:spacing w:before="0" w:after="40" w:line="276" w:lineRule="auto"/>
             </w:pPr>
             <w:r>
               <w:rPr>
@@ -35430,12 +35612,13 @@
               <w:rPr>
                 <w:sz w:val="26"/>
               </w:rPr>
-            </w:pPr>
-            <w:r>
-              <w:rPr>
-                <w:sz w:val="26"/>
-              </w:rPr>
-              <w:t>Record the observed result: ____________________  Pass / Fail: __________</w:t>
+              <w:spacing w:before="0" w:after="40" w:line="276" w:lineRule="auto"/>
+            </w:pPr>
+            <w:r>
+              <w:rPr>
+                <w:sz w:val="26"/>
+              </w:rPr>
+              <w:t xml:space="preserve">Status: Pending manual execution. Automated promotion, rounding and checkout-preview checks passed. Actual SQL persistence, promotion usage, duplicate submission handling and the confirmation/history screens still require end-to-end testing.</w:t>
             </w:r>
           </w:p>
         </w:tc>
@@ -35533,6 +35716,8 @@
       <w:tr>
         <w:trPr>
           <w:jc w:val="center"/>
+          <w:cantSplit/>
+          <w:tblHeader/>
         </w:trPr>
         <w:tc>
           <w:tcPr>
@@ -35546,6 +35731,7 @@
                 <w:b/>
                 <w:sz w:val="26"/>
               </w:rPr>
+              <w:spacing w:before="0" w:after="40" w:line="276" w:lineRule="auto"/>
             </w:pPr>
             <w:r>
               <w:rPr>
@@ -35568,6 +35754,7 @@
                 <w:b/>
                 <w:sz w:val="26"/>
               </w:rPr>
+              <w:spacing w:before="0" w:after="40" w:line="276" w:lineRule="auto"/>
             </w:pPr>
             <w:r>
               <w:rPr>
@@ -35582,6 +35769,7 @@
       <w:tr>
         <w:trPr>
           <w:jc w:val="center"/>
+          <w:cantSplit/>
         </w:trPr>
         <w:tc>
           <w:tcPr>
@@ -35594,6 +35782,7 @@
               <w:rPr>
                 <w:sz w:val="26"/>
               </w:rPr>
+              <w:spacing w:before="0" w:after="40" w:line="276" w:lineRule="auto"/>
             </w:pPr>
             <w:r>
               <w:rPr>
@@ -35614,12 +35803,13 @@
               <w:rPr>
                 <w:sz w:val="26"/>
               </w:rPr>
-            </w:pPr>
-            <w:r>
-              <w:rPr>
-                <w:sz w:val="26"/>
-              </w:rPr>
-              <w:t>Reservation date: a future date; time: an available time; guests: 2; table: select an active table available in the application.</w:t>
+              <w:spacing w:before="0" w:after="40" w:line="276" w:lineRule="auto"/>
+            </w:pPr>
+            <w:r>
+              <w:rPr>
+                <w:sz w:val="26"/>
+              </w:rPr>
+              <w:t xml:space="preserve">Customer: khach1.yamy@example.test; reservation: tomorrow at 18:00 in Vietnam time; party size: 2; an active available table with capacity ≥ 2. Negative variant: the same table at 18:30.</w:t>
             </w:r>
           </w:p>
         </w:tc>
@@ -35627,6 +35817,7 @@
       <w:tr>
         <w:trPr>
           <w:jc w:val="center"/>
+          <w:cantSplit/>
         </w:trPr>
         <w:tc>
           <w:tcPr>
@@ -35639,6 +35830,7 @@
               <w:rPr>
                 <w:sz w:val="26"/>
               </w:rPr>
+              <w:spacing w:before="0" w:after="40" w:line="276" w:lineRule="auto"/>
             </w:pPr>
             <w:r>
               <w:rPr>
@@ -35659,12 +35851,13 @@
               <w:rPr>
                 <w:sz w:val="26"/>
               </w:rPr>
-            </w:pPr>
-            <w:r>
-              <w:rPr>
-                <w:sz w:val="26"/>
-              </w:rPr>
-              <w:t>The customer can access the reservation function and at least one active table is configured.</w:t>
+              <w:spacing w:before="0" w:after="40" w:line="276" w:lineRule="auto"/>
+            </w:pPr>
+            <w:r>
+              <w:rPr>
+                <w:sz w:val="26"/>
+              </w:rPr>
+              <w:t xml:space="preserve">The customer is signed in. The selected table has no reservation or open-order conflict in the requested service window.</w:t>
             </w:r>
           </w:p>
         </w:tc>
@@ -35672,6 +35865,7 @@
       <w:tr>
         <w:trPr>
           <w:jc w:val="center"/>
+          <w:cantSplit/>
         </w:trPr>
         <w:tc>
           <w:tcPr>
@@ -35684,6 +35878,7 @@
               <w:rPr>
                 <w:sz w:val="26"/>
               </w:rPr>
+              <w:spacing w:before="0" w:after="40" w:line="276" w:lineRule="auto"/>
             </w:pPr>
             <w:r>
               <w:rPr>
@@ -35704,12 +35899,13 @@
               <w:rPr>
                 <w:sz w:val="26"/>
               </w:rPr>
-            </w:pPr>
-            <w:r>
-              <w:rPr>
-                <w:sz w:val="26"/>
-              </w:rPr>
-              <w:t>1. Open the reservation page. 2. Select a future date and available time. 3. Enter the number of guests. 4. Select a table if the interface requires it. 5. Submit the reservation. 6. Review the reservation confirmation or reservation history.</w:t>
+              <w:spacing w:before="0" w:after="40" w:line="276" w:lineRule="auto"/>
+            </w:pPr>
+            <w:r>
+              <w:rPr>
+                <w:sz w:val="26"/>
+              </w:rPr>
+              <w:t xml:space="preserve">1. Open the reservation form. 2. Select tomorrow at 18:00, two guests and an eligible table. 3. Submit and open reservation history. 4. Attempt another booking for the same table at 18:30. 5. Try a past time or a party larger than the table capacity.</w:t>
             </w:r>
           </w:p>
         </w:tc>
@@ -35717,6 +35913,7 @@
       <w:tr>
         <w:trPr>
           <w:jc w:val="center"/>
+          <w:cantSplit/>
         </w:trPr>
         <w:tc>
           <w:tcPr>
@@ -35729,6 +35926,7 @@
               <w:rPr>
                 <w:sz w:val="26"/>
               </w:rPr>
+              <w:spacing w:before="0" w:after="40" w:line="276" w:lineRule="auto"/>
             </w:pPr>
             <w:r>
               <w:rPr>
@@ -35749,12 +35947,13 @@
               <w:rPr>
                 <w:sz w:val="26"/>
               </w:rPr>
-            </w:pPr>
-            <w:r>
-              <w:rPr>
-                <w:sz w:val="26"/>
-              </w:rPr>
-              <w:t>A valid reservation is saved and appears in the relevant confirmation or history page. If the selected table/time conflicts with an existing reservation, the system should reject the conflicting request or ask the customer to choose another available option, according to the implemented validation.</w:t>
+              <w:spacing w:before="0" w:after="40" w:line="276" w:lineRule="auto"/>
+            </w:pPr>
+            <w:r>
+              <w:rPr>
+                <w:sz w:val="26"/>
+              </w:rPr>
+              <w:t xml:space="preserve">The valid reservation is stored as Pending and appears in the customer’s history. An overlapping two-hour booking, past service time or insufficient-capacity table is rejected without adding an invalid reservation.</w:t>
             </w:r>
           </w:p>
         </w:tc>
@@ -35762,6 +35961,7 @@
       <w:tr>
         <w:trPr>
           <w:jc w:val="center"/>
+          <w:cantSplit/>
         </w:trPr>
         <w:tc>
           <w:tcPr>
@@ -35774,6 +35974,7 @@
               <w:rPr>
                 <w:sz w:val="26"/>
               </w:rPr>
+              <w:spacing w:before="0" w:after="40" w:line="276" w:lineRule="auto"/>
             </w:pPr>
             <w:r>
               <w:rPr>
@@ -35794,12 +35995,13 @@
               <w:rPr>
                 <w:sz w:val="26"/>
               </w:rPr>
-            </w:pPr>
-            <w:r>
-              <w:rPr>
-                <w:sz w:val="26"/>
-              </w:rPr>
-              <w:t>Record the observed result: ____________________  Pass / Fail: __________</w:t>
+              <w:spacing w:before="0" w:after="40" w:line="276" w:lineRule="auto"/>
+            </w:pPr>
+            <w:r>
+              <w:rPr>
+                <w:sz w:val="26"/>
+              </w:rPr>
+              <w:t xml:space="preserve">Status: Pending manual execution. Automated interval-overlap rules passed. Database conflict queries, capacity validation and reservation/history rendering have not been exercised end to end.</w:t>
             </w:r>
           </w:p>
         </w:tc>
@@ -35895,6 +36097,8 @@
       <w:tr>
         <w:trPr>
           <w:jc w:val="center"/>
+          <w:cantSplit/>
+          <w:tblHeader/>
         </w:trPr>
         <w:tc>
           <w:tcPr>
@@ -35908,6 +36112,7 @@
                 <w:b/>
                 <w:sz w:val="26"/>
               </w:rPr>
+              <w:spacing w:before="0" w:after="40" w:line="276" w:lineRule="auto"/>
             </w:pPr>
             <w:r>
               <w:rPr>
@@ -35930,6 +36135,7 @@
                 <w:b/>
                 <w:sz w:val="26"/>
               </w:rPr>
+              <w:spacing w:before="0" w:after="40" w:line="276" w:lineRule="auto"/>
             </w:pPr>
             <w:r>
               <w:rPr>
@@ -35944,6 +36150,7 @@
       <w:tr>
         <w:trPr>
           <w:jc w:val="center"/>
+          <w:cantSplit/>
         </w:trPr>
         <w:tc>
           <w:tcPr>
@@ -35956,6 +36163,7 @@
               <w:rPr>
                 <w:sz w:val="26"/>
               </w:rPr>
+              <w:spacing w:before="0" w:after="40" w:line="276" w:lineRule="auto"/>
             </w:pPr>
             <w:r>
               <w:rPr>
@@ -35976,12 +36184,13 @@
               <w:rPr>
                 <w:sz w:val="26"/>
               </w:rPr>
-            </w:pPr>
-            <w:r>
-              <w:rPr>
-                <w:sz w:val="26"/>
-              </w:rPr>
-              <w:t>A valid staff account; one existing test order in a status that permits an update.</w:t>
+              <w:spacing w:before="0" w:after="40" w:line="276" w:lineRule="auto"/>
+            </w:pPr>
+            <w:r>
+              <w:rPr>
+                <w:sz w:val="26"/>
+              </w:rPr>
+              <w:t xml:space="preserve">Staff: staff.yamy@example.test / YamyDemo@2026!; one test order in Pending with an unpaid payment record. Use the order produced by the checkout scenario.</w:t>
             </w:r>
           </w:p>
         </w:tc>
@@ -35989,6 +36198,7 @@
       <w:tr>
         <w:trPr>
           <w:jc w:val="center"/>
+          <w:cantSplit/>
         </w:trPr>
         <w:tc>
           <w:tcPr>
@@ -36001,6 +36211,7 @@
               <w:rPr>
                 <w:sz w:val="26"/>
               </w:rPr>
+              <w:spacing w:before="0" w:after="40" w:line="276" w:lineRule="auto"/>
             </w:pPr>
             <w:r>
               <w:rPr>
@@ -36021,12 +36232,13 @@
               <w:rPr>
                 <w:sz w:val="26"/>
               </w:rPr>
-            </w:pPr>
-            <w:r>
-              <w:rPr>
-                <w:sz w:val="26"/>
-              </w:rPr>
-              <w:t>A test order has been created. The staff account has permission to access order management.</w:t>
+              <w:spacing w:before="0" w:after="40" w:line="276" w:lineRule="auto"/>
+            </w:pPr>
+            <w:r>
+              <w:rPr>
+                <w:sz w:val="26"/>
+              </w:rPr>
+              <w:t xml:space="preserve">The staff account is active and the order exists in the isolated test database. Keep its identifier for verification.</w:t>
             </w:r>
           </w:p>
         </w:tc>
@@ -36034,6 +36246,7 @@
       <w:tr>
         <w:trPr>
           <w:jc w:val="center"/>
+          <w:cantSplit/>
         </w:trPr>
         <w:tc>
           <w:tcPr>
@@ -36046,6 +36259,7 @@
               <w:rPr>
                 <w:sz w:val="26"/>
               </w:rPr>
+              <w:spacing w:before="0" w:after="40" w:line="276" w:lineRule="auto"/>
             </w:pPr>
             <w:r>
               <w:rPr>
@@ -36066,12 +36280,13 @@
               <w:rPr>
                 <w:sz w:val="26"/>
               </w:rPr>
-            </w:pPr>
-            <w:r>
-              <w:rPr>
-                <w:sz w:val="26"/>
-              </w:rPr>
-              <w:t>1. Sign in with the staff account. 2. Open the order-management page. 3. Locate the test order. 4. Open its details. 5. Change the order status to an allowed next status. 6. Save the change. 7. Reopen the order and verify the status.</w:t>
+              <w:spacing w:before="0" w:after="40" w:line="276" w:lineRule="auto"/>
+            </w:pPr>
+            <w:r>
+              <w:rPr>
+                <w:sz w:val="26"/>
+              </w:rPr>
+              <w:t xml:space="preserve">1. Sign in as staff. 2. Locate and open the order. 3. Attempt Pending → Ready. 4. Apply Pending → Confirmed → Preparing → Ready. 5. Attempt completion before payment. 6. Record payment as Completed. 7. Complete the order and refresh.</w:t>
             </w:r>
           </w:p>
         </w:tc>
@@ -36079,6 +36294,7 @@
       <w:tr>
         <w:trPr>
           <w:jc w:val="center"/>
+          <w:cantSplit/>
         </w:trPr>
         <w:tc>
           <w:tcPr>
@@ -36091,6 +36307,7 @@
               <w:rPr>
                 <w:sz w:val="26"/>
               </w:rPr>
+              <w:spacing w:before="0" w:after="40" w:line="276" w:lineRule="auto"/>
             </w:pPr>
             <w:r>
               <w:rPr>
@@ -36111,12 +36328,13 @@
               <w:rPr>
                 <w:sz w:val="26"/>
               </w:rPr>
-            </w:pPr>
-            <w:r>
-              <w:rPr>
-                <w:sz w:val="26"/>
-              </w:rPr>
-              <w:t>The authorized staff member can view and update the order status. The saved status remains visible after the page is refreshed. Users without the required permission should not be able to perform staff-only actions.</w:t>
+              <w:spacing w:before="0" w:after="40" w:line="276" w:lineRule="auto"/>
+            </w:pPr>
+            <w:r>
+              <w:rPr>
+                <w:sz w:val="26"/>
+              </w:rPr>
+              <w:t xml:space="preserve">Skipped transitions are rejected. Allowed transitions are saved. An unpaid order cannot complete. After payment is Completed, Ready can become Delivered, shown as completed in the Vietnamese interface. The saved order/payment statuses remain after refresh.</w:t>
             </w:r>
           </w:p>
         </w:tc>
@@ -36124,6 +36342,7 @@
       <w:tr>
         <w:trPr>
           <w:jc w:val="center"/>
+          <w:cantSplit/>
         </w:trPr>
         <w:tc>
           <w:tcPr>
@@ -36136,6 +36355,7 @@
               <w:rPr>
                 <w:sz w:val="26"/>
               </w:rPr>
+              <w:spacing w:before="0" w:after="40" w:line="276" w:lineRule="auto"/>
             </w:pPr>
             <w:r>
               <w:rPr>
@@ -36156,12 +36376,13 @@
               <w:rPr>
                 <w:sz w:val="26"/>
               </w:rPr>
-            </w:pPr>
-            <w:r>
-              <w:rPr>
-                <w:sz w:val="26"/>
-              </w:rPr>
-              <w:t>Record the observed result: ____________________  Pass / Fail: __________</w:t>
+              <w:spacing w:before="0" w:after="40" w:line="276" w:lineRule="auto"/>
+            </w:pPr>
+            <w:r>
+              <w:rPr>
+                <w:sz w:val="26"/>
+              </w:rPr>
+              <w:t xml:space="preserve">Status: Pending manual execution. Automated order/payment transition and unpaid-completion rules passed. Staff authorization, controller actions and persisted database changes remain unverified in a live session.</w:t>
             </w:r>
           </w:p>
         </w:tc>
@@ -36256,6 +36477,8 @@
       <w:tr>
         <w:trPr>
           <w:jc w:val="center"/>
+          <w:cantSplit/>
+          <w:tblHeader/>
         </w:trPr>
         <w:tc>
           <w:tcPr>
@@ -36269,6 +36492,7 @@
                 <w:b/>
                 <w:sz w:val="26"/>
               </w:rPr>
+              <w:spacing w:before="0" w:after="40" w:line="276" w:lineRule="auto"/>
             </w:pPr>
             <w:r>
               <w:rPr>
@@ -36291,6 +36515,7 @@
                 <w:b/>
                 <w:sz w:val="26"/>
               </w:rPr>
+              <w:spacing w:before="0" w:after="40" w:line="276" w:lineRule="auto"/>
             </w:pPr>
             <w:r>
               <w:rPr>
@@ -36305,6 +36530,7 @@
       <w:tr>
         <w:trPr>
           <w:jc w:val="center"/>
+          <w:cantSplit/>
         </w:trPr>
         <w:tc>
           <w:tcPr>
@@ -36317,6 +36543,7 @@
               <w:rPr>
                 <w:sz w:val="26"/>
               </w:rPr>
+              <w:spacing w:before="0" w:after="40" w:line="276" w:lineRule="auto"/>
             </w:pPr>
             <w:r>
               <w:rPr>
@@ -36337,12 +36564,13 @@
               <w:rPr>
                 <w:sz w:val="26"/>
               </w:rPr>
-            </w:pPr>
-            <w:r>
-              <w:rPr>
-                <w:sz w:val="26"/>
-              </w:rPr>
-              <w:t>Administrator account; category name: “Test Category”; dish name: “Test Dish”; description: “Sample menu item”; price: use a valid positive value; select an existing category.</w:t>
+              <w:spacing w:before="0" w:after="40" w:line="276" w:lineRule="auto"/>
+            </w:pPr>
+            <w:r>
+              <w:rPr>
+                <w:sz w:val="26"/>
+              </w:rPr>
+              <w:t xml:space="preserve">Admin: admin.yamy@example.test / YamyDemo@2026!; category: Test Category; dish: Test Dish; description: Sample menu item; price: VND 50,000; preparation: 15 minutes; status: Available. Edit price to VND 55,000.</w:t>
             </w:r>
           </w:p>
         </w:tc>
@@ -36350,6 +36578,7 @@
       <w:tr>
         <w:trPr>
           <w:jc w:val="center"/>
+          <w:cantSplit/>
         </w:trPr>
         <w:tc>
           <w:tcPr>
@@ -36362,6 +36591,7 @@
               <w:rPr>
                 <w:sz w:val="26"/>
               </w:rPr>
+              <w:spacing w:before="0" w:after="40" w:line="276" w:lineRule="auto"/>
             </w:pPr>
             <w:r>
               <w:rPr>
@@ -36382,12 +36612,13 @@
               <w:rPr>
                 <w:sz w:val="26"/>
               </w:rPr>
-            </w:pPr>
-            <w:r>
-              <w:rPr>
-                <w:sz w:val="26"/>
-              </w:rPr>
-              <w:t>The administrator account can access the protected management pages.</w:t>
+              <w:spacing w:before="0" w:after="40" w:line="276" w:lineRule="auto"/>
+            </w:pPr>
+            <w:r>
+              <w:rPr>
+                <w:sz w:val="26"/>
+              </w:rPr>
+              <w:t xml:space="preserve">The administrator is signed in. Test names do not already exist and the database is a disposable test copy.</w:t>
             </w:r>
           </w:p>
         </w:tc>
@@ -36395,6 +36626,7 @@
       <w:tr>
         <w:trPr>
           <w:jc w:val="center"/>
+          <w:cantSplit/>
         </w:trPr>
         <w:tc>
           <w:tcPr>
@@ -36407,6 +36639,7 @@
               <w:rPr>
                 <w:sz w:val="26"/>
               </w:rPr>
+              <w:spacing w:before="0" w:after="40" w:line="276" w:lineRule="auto"/>
             </w:pPr>
             <w:r>
               <w:rPr>
@@ -36427,19 +36660,20 @@
               <w:rPr>
                 <w:sz w:val="26"/>
               </w:rPr>
-            </w:pPr>
-            <w:r>
-              <w:rPr>
-                <w:sz w:val="26"/>
-              </w:rPr>
-              <w:t xml:space="preserve">1. Sign in as administrator. 2. Open category management </w:t>
+              <w:spacing w:before="0" w:after="40" w:line="276" w:lineRule="auto"/>
+            </w:pPr>
+            <w:r>
+              <w:rPr>
+                <w:sz w:val="26"/>
+              </w:rPr>
+              <w:t xml:space="preserve">1. Create Test Category. 2. Create Test Dish in that category using the test data. 3. Check both management lists. 4. Edit the price to VND 55,000, save and refresh. 5. Attempt to save a dish with an empty name, then a negative price.</w:t>
             </w:r>
             <w:r>
               <w:rPr>
                 <w:sz w:val="26"/>
               </w:rPr>
               <w:lastRenderedPageBreak/>
-              <w:t>and create the test category if creation is available. 3. Save and verify the category in the list. 4. Open dish/menu management. 5. Create a test dish with the required fields. 6. Save and verify the dish. 7. Edit a field and save again, if editing is supported.</w:t>
+              <w:t/>
             </w:r>
           </w:p>
         </w:tc>
@@ -36447,6 +36681,7 @@
       <w:tr>
         <w:trPr>
           <w:jc w:val="center"/>
+          <w:cantSplit/>
         </w:trPr>
         <w:tc>
           <w:tcPr>
@@ -36459,6 +36694,7 @@
               <w:rPr>
                 <w:sz w:val="26"/>
               </w:rPr>
+              <w:spacing w:before="0" w:after="40" w:line="276" w:lineRule="auto"/>
             </w:pPr>
             <w:r>
               <w:rPr>
@@ -36480,12 +36716,13 @@
               <w:rPr>
                 <w:sz w:val="26"/>
               </w:rPr>
-            </w:pPr>
-            <w:r>
-              <w:rPr>
-                <w:sz w:val="26"/>
-              </w:rPr>
-              <w:t>Valid category and dish data are saved and displayed in the management lists. Required-field and value validation should prevent invalid records from being saved. Only authorized users should access protected management functions.</w:t>
+              <w:spacing w:before="0" w:after="40" w:line="276" w:lineRule="auto"/>
+            </w:pPr>
+            <w:r>
+              <w:rPr>
+                <w:sz w:val="26"/>
+              </w:rPr>
+              <w:t xml:space="preserve">Valid category/dish records are saved and displayed. The edited price remains after refresh. Required-name and value validation prevent invalid records. Only permitted roles can perform the corresponding management actions.</w:t>
             </w:r>
           </w:p>
         </w:tc>
@@ -36493,6 +36730,7 @@
       <w:tr>
         <w:trPr>
           <w:jc w:val="center"/>
+          <w:cantSplit/>
         </w:trPr>
         <w:tc>
           <w:tcPr>
@@ -36505,6 +36743,7 @@
               <w:rPr>
                 <w:sz w:val="26"/>
               </w:rPr>
+              <w:spacing w:before="0" w:after="40" w:line="276" w:lineRule="auto"/>
             </w:pPr>
             <w:r>
               <w:rPr>
@@ -36525,12 +36764,13 @@
               <w:rPr>
                 <w:sz w:val="26"/>
               </w:rPr>
-            </w:pPr>
-            <w:r>
-              <w:rPr>
-                <w:sz w:val="26"/>
-              </w:rPr>
-              <w:t>Record the observed result: ____________________  Pass / Fail: __________</w:t>
+              <w:spacing w:before="0" w:after="40" w:line="276" w:lineRule="auto"/>
+            </w:pPr>
+            <w:r>
+              <w:rPr>
+                <w:sz w:val="26"/>
+              </w:rPr>
+              <w:t xml:space="preserve">Status: Pending manual execution. Source inspection identifies catalogue validation and management actions, but database creation/editing and their form-validation responses have not been manually executed.</w:t>
             </w:r>
           </w:p>
         </w:tc>
@@ -36625,6 +36865,8 @@
       <w:tr>
         <w:trPr>
           <w:jc w:val="center"/>
+          <w:cantSplit/>
+          <w:tblHeader/>
         </w:trPr>
         <w:tc>
           <w:tcPr>
@@ -36637,6 +36879,7 @@
               <w:rPr>
                 <w:sz w:val="26"/>
               </w:rPr>
+              <w:spacing w:before="0" w:after="40" w:line="276" w:lineRule="auto"/>
             </w:pPr>
             <w:r>
               <w:rPr>
@@ -36657,6 +36900,7 @@
               <w:rPr>
                 <w:sz w:val="26"/>
               </w:rPr>
+              <w:spacing w:before="0" w:after="40" w:line="276" w:lineRule="auto"/>
             </w:pPr>
             <w:r>
               <w:rPr>
@@ -36670,6 +36914,7 @@
       <w:tr>
         <w:trPr>
           <w:jc w:val="center"/>
+          <w:cantSplit/>
         </w:trPr>
         <w:tc>
           <w:tcPr>
@@ -36682,6 +36927,7 @@
               <w:rPr>
                 <w:sz w:val="26"/>
               </w:rPr>
+              <w:spacing w:before="0" w:after="40" w:line="276" w:lineRule="auto"/>
             </w:pPr>
             <w:r>
               <w:rPr>
@@ -36702,12 +36948,13 @@
               <w:rPr>
                 <w:sz w:val="26"/>
               </w:rPr>
-            </w:pPr>
-            <w:r>
-              <w:rPr>
-                <w:sz w:val="26"/>
-              </w:rPr>
-              <w:t>One customer account and one administrator or staff account, depending on the roles configured in the current build.</w:t>
+              <w:spacing w:before="0" w:after="40" w:line="276" w:lineRule="auto"/>
+            </w:pPr>
+            <w:r>
+              <w:rPr>
+                <w:sz w:val="26"/>
+              </w:rPr>
+              <w:t xml:space="preserve">Customer: khach1.yamy@example.test; Staff: staff.yamy@example.test; Admin: admin.yamy@example.test. Initial sample password: YamyDemo@2026!. Use separate sessions or sign out between accounts.</w:t>
             </w:r>
           </w:p>
         </w:tc>
@@ -36715,6 +36962,7 @@
       <w:tr>
         <w:trPr>
           <w:jc w:val="center"/>
+          <w:cantSplit/>
         </w:trPr>
         <w:tc>
           <w:tcPr>
@@ -36727,6 +36975,7 @@
               <w:rPr>
                 <w:sz w:val="26"/>
               </w:rPr>
+              <w:spacing w:before="0" w:after="40" w:line="276" w:lineRule="auto"/>
             </w:pPr>
             <w:r>
               <w:rPr>
@@ -36747,12 +36996,13 @@
               <w:rPr>
                 <w:sz w:val="26"/>
               </w:rPr>
-            </w:pPr>
-            <w:r>
-              <w:rPr>
-                <w:sz w:val="26"/>
-              </w:rPr>
-              <w:t>Both accounts exist and have their intended roles.</w:t>
+              <w:spacing w:before="0" w:after="40" w:line="276" w:lineRule="auto"/>
+            </w:pPr>
+            <w:r>
+              <w:rPr>
+                <w:sz w:val="26"/>
+              </w:rPr>
+              <w:t xml:space="preserve">All accounts are active and have the correct roles. Obtain a valid protected management URL from the administrator session.</w:t>
             </w:r>
           </w:p>
         </w:tc>
@@ -36760,6 +37010,7 @@
       <w:tr>
         <w:trPr>
           <w:jc w:val="center"/>
+          <w:cantSplit/>
         </w:trPr>
         <w:tc>
           <w:tcPr>
@@ -36772,6 +37023,7 @@
               <w:rPr>
                 <w:sz w:val="26"/>
               </w:rPr>
+              <w:spacing w:before="0" w:after="40" w:line="276" w:lineRule="auto"/>
             </w:pPr>
             <w:r>
               <w:rPr>
@@ -36792,12 +37044,13 @@
               <w:rPr>
                 <w:sz w:val="26"/>
               </w:rPr>
-            </w:pPr>
-            <w:r>
-              <w:rPr>
-                <w:sz w:val="26"/>
-              </w:rPr>
-              <w:t>1. Sign in as a customer. 2. Attempt to open a protected management URL directly. 3. Confirm the response. 4. Sign out. 5. Sign in using an authorized staff or administrator account. 6. Open the corresponding management page.</w:t>
+              <w:spacing w:before="0" w:after="40" w:line="276" w:lineRule="auto"/>
+            </w:pPr>
+            <w:r>
+              <w:rPr>
+                <w:sz w:val="26"/>
+              </w:rPr>
+              <w:t xml:space="preserve">1. Sign in as Customer and request an Admin URL directly. 2. Sign in as Staff and repeat. 3. Verify Staff workspace access and absence of dish deletion. 4. Sign in as Admin and switch to Staff, then back to Admin. 5. Confirm another user’s account page exposes viewing, reset and lock controls rather than unrestricted profile editing.</w:t>
             </w:r>
           </w:p>
         </w:tc>
@@ -36805,6 +37058,7 @@
       <w:tr>
         <w:trPr>
           <w:jc w:val="center"/>
+          <w:cantSplit/>
         </w:trPr>
         <w:tc>
           <w:tcPr>
@@ -36817,6 +37071,7 @@
               <w:rPr>
                 <w:sz w:val="26"/>
               </w:rPr>
+              <w:spacing w:before="0" w:after="40" w:line="276" w:lineRule="auto"/>
             </w:pPr>
             <w:r>
               <w:rPr>
@@ -36837,12 +37092,13 @@
               <w:rPr>
                 <w:sz w:val="26"/>
               </w:rPr>
-            </w:pPr>
-            <w:r>
-              <w:rPr>
-                <w:sz w:val="26"/>
-              </w:rPr>
-              <w:t>The customer cannot access restricted management functions. An authorized account can access only the functions permitted by its role.</w:t>
+              <w:spacing w:before="0" w:after="40" w:line="276" w:lineRule="auto"/>
+            </w:pPr>
+            <w:r>
+              <w:rPr>
+                <w:sz w:val="26"/>
+              </w:rPr>
+              <w:t xml:space="preserve">Customers cannot access restricted workspaces; Staff cannot access Admin-only functions. Login opens each role’s designated home. Admin can use both operator workspaces while retaining the Admin role. Staff dish deletion is unavailable, and user-account controls match the administrator’s permitted operations.</w:t>
             </w:r>
           </w:p>
         </w:tc>
@@ -36850,6 +37106,7 @@
       <w:tr>
         <w:trPr>
           <w:jc w:val="center"/>
+          <w:cantSplit/>
         </w:trPr>
         <w:tc>
           <w:tcPr>
@@ -36862,6 +37119,7 @@
               <w:rPr>
                 <w:sz w:val="26"/>
               </w:rPr>
+              <w:spacing w:before="0" w:after="40" w:line="276" w:lineRule="auto"/>
             </w:pPr>
             <w:r>
               <w:rPr>
@@ -36882,12 +37140,13 @@
               <w:rPr>
                 <w:sz w:val="26"/>
               </w:rPr>
-            </w:pPr>
-            <w:r>
-              <w:rPr>
-                <w:sz w:val="26"/>
-              </w:rPr>
-              <w:t>Record the observed result: ____________________  Pass / Fail: __________</w:t>
+              <w:spacing w:before="0" w:after="40" w:line="276" w:lineRule="auto"/>
+            </w:pPr>
+            <w:r>
+              <w:rPr>
+                <w:sz w:val="26"/>
+              </w:rPr>
+              <w:t xml:space="preserve">Status: Pending manual execution. Selected role-dependent business rules passed automated checks. Authentication/session enforcement, direct URL responses, workspace navigation and account-action forms require Windows/IIS integration testing.</w:t>
             </w:r>
           </w:p>
         </w:tc>
@@ -36907,12 +37166,12 @@
     </w:p>
     <w:p>
       <w:r>
-        <w:t>The scenarios above are intended to verify the core workflows of account access, menu browsing, cart management, order placement, table reservation, staff order processing, and administrative catalogue management. The system can be evaluated as meeting the tested requirements only after the scenarios have been executed and their actual outcomes recorded.</w:t>
-      </w:r>
-    </w:p>
-    <w:p>
-      <w:r>
-        <w:t>For each failed scenario, record the steps that produced the failure, the relevant input, and any error message. Correct the issue and repeat the scenario. Testing should also confirm that changes saved to the database remain available after navigating away from the page or refreshing it. The final report should summarize the number of passed and failed scenarios based on the actual test run rather than estimated results.</w:t>
+        <w:t xml:space="preserve">The report verification run completed 74 automated rule/helper assertions and four JavaScript suites with no failures. Coverage includes permitted order/payment transitions, reservation-overlap arithmetic, promotion eligibility and rounding, catalogue filtering, immediate promotion previews and image fallback. These results support the tested components only; they do not establish that all forms, role sessions, database transactions or complete user journeys work correctly in the intended Windows environment.</w:t>
+      </w:r>
+    </w:p>
+    <w:p>
+      <w:r>
+        <w:t xml:space="preserve">Eight manual workflow scenarios are defined in Tables 4-2 to 4-9, but none has a recorded live Windows/IIS and SQL Server execution in this report update. Consequently, no manual scenario is marked Pass or Fail. After execution, record the actual browser/database versions, observed results, relevant order or reservation identifiers and any failure messages. Re-test fixes and update the summary using observed outcomes. Remaining verification includes database initialization, persistence, role access, external photographs and payment-recording behaviour; external payment settlement is outside the automated checks.</w:t>
       </w:r>
     </w:p>
     <w:p>
@@ -36974,7 +37233,7 @@
         <w:t xml:space="preserve"> </w:t>
       </w:r>
       <w:r>
-        <w:t>Testing Resutls</w:t>
+        <w:t>Testing Results</w:t>
       </w:r>
       <w:bookmarkEnd w:id="164"/>
       <w:bookmarkEnd w:id="165"/>
@@ -36993,6 +37252,8 @@
       <w:tr>
         <w:trPr>
           <w:jc w:val="center"/>
+          <w:cantSplit/>
+          <w:tblHeader/>
         </w:trPr>
         <w:tc>
           <w:tcPr>
@@ -37005,6 +37266,7 @@
               <w:rPr>
                 <w:sz w:val="26"/>
               </w:rPr>
+              <w:spacing w:before="0" w:after="40" w:line="276" w:lineRule="auto"/>
             </w:pPr>
             <w:r>
               <w:rPr>
@@ -37025,12 +37287,13 @@
               <w:rPr>
                 <w:sz w:val="26"/>
               </w:rPr>
-            </w:pPr>
-            <w:r>
-              <w:rPr>
-                <w:sz w:val="26"/>
-              </w:rPr>
-              <w:t>Value to complete after testing</w:t>
+              <w:spacing w:before="0" w:after="40" w:line="276" w:lineRule="auto"/>
+            </w:pPr>
+            <w:r>
+              <w:rPr>
+                <w:sz w:val="26"/>
+              </w:rPr>
+              <w:t xml:space="preserve">Recorded outcome and verification scope</w:t>
             </w:r>
           </w:p>
         </w:tc>
@@ -37038,6 +37301,7 @@
       <w:tr>
         <w:trPr>
           <w:jc w:val="center"/>
+          <w:cantSplit/>
         </w:trPr>
         <w:tc>
           <w:tcPr>
@@ -37050,6 +37314,7 @@
               <w:rPr>
                 <w:sz w:val="26"/>
               </w:rPr>
+              <w:spacing w:before="0" w:after="40" w:line="276" w:lineRule="auto"/>
             </w:pPr>
             <w:r>
               <w:rPr>
@@ -37070,12 +37335,13 @@
               <w:rPr>
                 <w:sz w:val="26"/>
               </w:rPr>
-            </w:pPr>
-            <w:r>
-              <w:rPr>
-                <w:sz w:val="26"/>
-              </w:rPr>
-              <w:t>__________</w:t>
+              <w:spacing w:before="0" w:after="40" w:line="276" w:lineRule="auto"/>
+            </w:pPr>
+            <w:r>
+              <w:rPr>
+                <w:sz w:val="26"/>
+              </w:rPr>
+              <w:t xml:space="preserve">0 of 8 manual workflow scenarios; all 8 are prepared and pending Windows/IIS and SQL Server execution.</w:t>
             </w:r>
           </w:p>
         </w:tc>
@@ -37083,6 +37349,7 @@
       <w:tr>
         <w:trPr>
           <w:jc w:val="center"/>
+          <w:cantSplit/>
         </w:trPr>
         <w:tc>
           <w:tcPr>
@@ -37095,6 +37362,7 @@
               <w:rPr>
                 <w:sz w:val="26"/>
               </w:rPr>
+              <w:spacing w:before="0" w:after="40" w:line="276" w:lineRule="auto"/>
             </w:pPr>
             <w:r>
               <w:rPr>
@@ -37115,12 +37383,13 @@
               <w:rPr>
                 <w:sz w:val="26"/>
               </w:rPr>
-            </w:pPr>
-            <w:r>
-              <w:rPr>
-                <w:sz w:val="26"/>
-              </w:rPr>
-              <w:t>__________</w:t>
+              <w:spacing w:before="0" w:after="40" w:line="276" w:lineRule="auto"/>
+            </w:pPr>
+            <w:r>
+              <w:rPr>
+                <w:sz w:val="26"/>
+              </w:rPr>
+              <w:t xml:space="preserve">0 manual scenarios recorded as Pass. Separately: 74 automated assertions and 4 JavaScript suites passed.</w:t>
             </w:r>
           </w:p>
         </w:tc>
@@ -37128,6 +37397,7 @@
       <w:tr>
         <w:trPr>
           <w:jc w:val="center"/>
+          <w:cantSplit/>
         </w:trPr>
         <w:tc>
           <w:tcPr>
@@ -37140,6 +37410,7 @@
               <w:rPr>
                 <w:sz w:val="26"/>
               </w:rPr>
+              <w:spacing w:before="0" w:after="40" w:line="276" w:lineRule="auto"/>
             </w:pPr>
             <w:r>
               <w:rPr>
@@ -37160,12 +37431,13 @@
               <w:rPr>
                 <w:sz w:val="26"/>
               </w:rPr>
-            </w:pPr>
-            <w:r>
-              <w:rPr>
-                <w:sz w:val="26"/>
-              </w:rPr>
-              <w:t>__________</w:t>
+              <w:spacing w:before="0" w:after="40" w:line="276" w:lineRule="auto"/>
+            </w:pPr>
+            <w:r>
+              <w:rPr>
+                <w:sz w:val="26"/>
+              </w:rPr>
+              <w:t xml:space="preserve">0 manual scenarios recorded as Fail because none was executed; this is not a claim that the application has no defects. Automated failures in this run: 0.</w:t>
             </w:r>
           </w:p>
         </w:tc>
@@ -37173,6 +37445,7 @@
       <w:tr>
         <w:trPr>
           <w:jc w:val="center"/>
+          <w:cantSplit/>
         </w:trPr>
         <w:tc>
           <w:tcPr>
@@ -37185,6 +37458,7 @@
               <w:rPr>
                 <w:sz w:val="26"/>
               </w:rPr>
+              <w:spacing w:before="0" w:after="40" w:line="276" w:lineRule="auto"/>
             </w:pPr>
             <w:r>
               <w:rPr>
@@ -37205,12 +37479,13 @@
               <w:rPr>
                 <w:sz w:val="26"/>
               </w:rPr>
-            </w:pPr>
-            <w:r>
-              <w:rPr>
-                <w:sz w:val="26"/>
-              </w:rPr>
-              <w:t>__________</w:t>
+              <w:spacing w:before="0" w:after="40" w:line="276" w:lineRule="auto"/>
+            </w:pPr>
+            <w:r>
+              <w:rPr>
+                <w:sz w:val="26"/>
+              </w:rPr>
+              <w:t xml:space="preserve">No runtime defect was confirmed or corrected during this report update. Documentation test data and workflow descriptions were aligned with the current Yamy implementation.</w:t>
             </w:r>
           </w:p>
         </w:tc>
@@ -37218,6 +37493,7 @@
       <w:tr>
         <w:trPr>
           <w:jc w:val="center"/>
+          <w:cantSplit/>
         </w:trPr>
         <w:tc>
           <w:tcPr>
@@ -37230,6 +37506,7 @@
               <w:rPr>
                 <w:sz w:val="26"/>
               </w:rPr>
+              <w:spacing w:before="0" w:after="40" w:line="276" w:lineRule="auto"/>
             </w:pPr>
             <w:r>
               <w:rPr>
@@ -37250,12 +37527,109 @@
               <w:rPr>
                 <w:sz w:val="26"/>
               </w:rPr>
-            </w:pPr>
-            <w:r>
-              <w:rPr>
-                <w:sz w:val="26"/>
-              </w:rPr>
-              <w:t>Complete after executing all scenarios</w:t>
+              <w:spacing w:before="0" w:after="40" w:line="276" w:lineRule="auto"/>
+            </w:pPr>
+            <w:r>
+              <w:rPr>
+                <w:sz w:val="26"/>
+              </w:rPr>
+              <w:t xml:space="preserve">Component-level automated checks passed. Overall manual acceptance remains pending; successful end-to-end operation and deployment readiness cannot yet be concluded.</w:t>
+            </w:r>
+          </w:p>
+        </w:tc>
+      </w:tr>
+      <w:tr>
+        <w:trPr>
+          <w:jc w:val="center"/>
+          <w:cantSplit/>
+        </w:trPr>
+        <w:tc>
+          <w:tcPr>
+            <w:tcW w:w="3038" w:type="dxa"/>
+            <w:vAlign w:val="center"/>
+          </w:tcPr>
+          <w:p>
+            <w:pPr>
+              <w:pStyle w:val="LeftNormal"/>
+              <w:rPr>
+                <w:sz w:val="26"/>
+              </w:rPr>
+              <w:spacing w:before="0" w:after="40" w:line="276" w:lineRule="auto"/>
+            </w:pPr>
+            <w:r>
+              <w:rPr>
+                <w:sz w:val="26"/>
+              </w:rPr>
+              <w:t xml:space="preserve">Automated checks executed</w:t>
+            </w:r>
+          </w:p>
+        </w:tc>
+        <w:tc>
+          <w:tcPr>
+            <w:tcW w:w="5740" w:type="dxa"/>
+            <w:vAlign w:val="center"/>
+          </w:tcPr>
+          <w:p>
+            <w:pPr>
+              <w:pStyle w:val="LeftNormal"/>
+              <w:rPr>
+                <w:sz w:val="26"/>
+              </w:rPr>
+              <w:spacing w:before="0" w:after="40" w:line="276" w:lineRule="auto"/>
+            </w:pPr>
+            <w:r>
+              <w:rPr>
+                <w:sz w:val="26"/>
+              </w:rPr>
+              <w:t xml:space="preserve">74 C# rule/helper assertions and 4 JavaScript suites executed against current source for this report update; all passed. They are not counted as the eight manual scenarios.</w:t>
+            </w:r>
+          </w:p>
+        </w:tc>
+      </w:tr>
+      <w:tr>
+        <w:trPr>
+          <w:jc w:val="center"/>
+          <w:cantSplit/>
+        </w:trPr>
+        <w:tc>
+          <w:tcPr>
+            <w:tcW w:w="3038" w:type="dxa"/>
+            <w:vAlign w:val="center"/>
+          </w:tcPr>
+          <w:p>
+            <w:pPr>
+              <w:pStyle w:val="LeftNormal"/>
+              <w:rPr>
+                <w:sz w:val="26"/>
+              </w:rPr>
+              <w:spacing w:before="0" w:after="40" w:line="276" w:lineRule="auto"/>
+            </w:pPr>
+            <w:r>
+              <w:rPr>
+                <w:sz w:val="26"/>
+              </w:rPr>
+              <w:t xml:space="preserve">Evidence and limitations</w:t>
+            </w:r>
+          </w:p>
+        </w:tc>
+        <w:tc>
+          <w:tcPr>
+            <w:tcW w:w="5740" w:type="dxa"/>
+            <w:vAlign w:val="center"/>
+          </w:tcPr>
+          <w:p>
+            <w:pPr>
+              <w:pStyle w:val="LeftNormal"/>
+              <w:rPr>
+                <w:sz w:val="26"/>
+              </w:rPr>
+              <w:spacing w:before="0" w:after="40" w:line="276" w:lineRule="auto"/>
+            </w:pPr>
+            <w:r>
+              <w:rPr>
+                <w:sz w:val="26"/>
+              </w:rPr>
+              <w:t xml:space="preserve">The test harnesses were recovered from earlier repository history into a temporary verification directory. No IIS browser session, SQL Server/LocalDB integration run or external payment settlement was executed in this update.</w:t>
             </w:r>
           </w:p>
         </w:tc>
@@ -37273,118 +37647,832 @@
     </w:p>
     <w:p>
       <w:r>
-        <w:t>This section demonstrates the main interfaces of the Restaurant and Food Order Management System. Insert screenshots captured from the running application. Use the figure numbers and captions below, and remove any figure that does not correspond to a function available in the current build. The screenshots should show the actual application rather than mock-ups.</w:t>
-      </w:r>
-    </w:p>
-    <w:p>
-      <w:r>
-        <w:t>Figure 4-1: Home Page and Food Menu</w:t>
-      </w:r>
-    </w:p>
-    <w:p>
-      <w:r>
-        <w:lastRenderedPageBreak/>
-        <w:t>[Insert a screenshot of the home page or menu listing showing available categories and dishes.]</w:t>
-      </w:r>
-    </w:p>
-    <w:p>
-      <w:r>
-        <w:t>Figure 4-2: Account Registration Interface</w:t>
-      </w:r>
-    </w:p>
-    <w:p>
-      <w:r>
-        <w:t>[Insert a screenshot of the registration form. Do not show real personal information.]</w:t>
-      </w:r>
-    </w:p>
-    <w:p>
-      <w:r>
-        <w:t>Figure 4-3: Login Interface</w:t>
-      </w:r>
-    </w:p>
-    <w:p>
-      <w:r>
-        <w:t>[Insert a screenshot of the login form.]</w:t>
-      </w:r>
-    </w:p>
-    <w:p>
-      <w:r>
-        <w:t>Figure 4-4: Food Details Interface</w:t>
-      </w:r>
-    </w:p>
-    <w:p>
-      <w:r>
-        <w:t>[Insert a screenshot showing the selected dish details and displayed price.]</w:t>
-      </w:r>
-    </w:p>
-    <w:p>
-      <w:r>
-        <w:t>Figure 4-5: Shopping Cart Interface</w:t>
-      </w:r>
-    </w:p>
-    <w:p>
-      <w:r>
-        <w:t>[Insert a screenshot showing cart items, quantities, and the total.]</w:t>
-      </w:r>
-    </w:p>
-    <w:p>
-      <w:r>
-        <w:t>Figure 4-6: Checkout Interface</w:t>
-      </w:r>
-    </w:p>
-    <w:p>
-      <w:r>
-        <w:t>[Insert a screenshot of the checkout form and available order options.]</w:t>
-      </w:r>
-    </w:p>
-    <w:p>
-      <w:r>
-        <w:t>Figure 4-7: Order Confirmation or Order History</w:t>
-      </w:r>
-    </w:p>
-    <w:p>
-      <w:r>
-        <w:t>[Insert a screenshot showing a successfully created test order or the order-history list.]</w:t>
-      </w:r>
-    </w:p>
-    <w:p>
-      <w:r>
-        <w:t>Figure 4-8: Table Reservation Interface</w:t>
-      </w:r>
-    </w:p>
-    <w:p>
-      <w:r>
-        <w:t>[Insert a screenshot of the reservation form or reservation history.]</w:t>
-      </w:r>
-    </w:p>
-    <w:p>
-      <w:r>
-        <w:t>Figure 4-9: Staff Order Management Interface</w:t>
-      </w:r>
-    </w:p>
-    <w:p>
-      <w:r>
-        <w:t>[Insert a screenshot of the staff order list and status-management controls.]</w:t>
-      </w:r>
-    </w:p>
-    <w:p>
-      <w:r>
-        <w:t>Figure 4-10: Category and Dish Management Interface</w:t>
-      </w:r>
-    </w:p>
-    <w:p>
-      <w:r>
-        <w:t>[Insert a screenshot of the authorized management page showing category or dish records.]</w:t>
-      </w:r>
-    </w:p>
-    <w:p>
-      <w:r>
-        <w:t>Figure 4-11: User/Administration Interface</w:t>
-      </w:r>
-    </w:p>
-    <w:p>
-      <w:r>
-        <w:t>[Insert a screenshot of an administration page only if it exists in the current build.]</w:t>
+        <w:t xml:space="preserve">The following descriptions explain the interfaces implemented in the Yamy build and specify the screenshots to add. Capture the running application with demonstration accounts and current sample data. Keep navigation, page titles and relevant success/validation messages visible; do not expose real personal data or passwords. These descriptions are implementation walkthroughs, not evidence that the corresponding manual tests have passed. Replace each screenshot instruction with the actual capture before final submission.</w:t>
+      </w:r>
+    </w:p>
+    <w:p>
+      <w:pPr>
+        <w:pStyle w:val="Caption"/>
+        <w:keepNext/>
+      </w:pPr>
+      <w:r>
+        <w:t xml:space="preserve">Figure </w:t>
+      </w:r>
+      <w:r>
+        <w:fldChar w:fldCharType="begin"/>
+      </w:r>
+      <w:r>
+        <w:instrText xml:space="preserve"> STYLEREF 1 \s </w:instrText>
+      </w:r>
+      <w:r>
+        <w:fldChar w:fldCharType="separate"/>
+      </w:r>
+      <w:r>
+        <w:t xml:space="preserve">4</w:t>
+      </w:r>
+      <w:r>
+        <w:fldChar w:fldCharType="end"/>
+      </w:r>
+      <w:r>
+        <w:t xml:space="preserve">-</w:t>
+      </w:r>
+      <w:r>
+        <w:fldChar w:fldCharType="begin"/>
+      </w:r>
+      <w:r>
+        <w:instrText xml:space="preserve"> SEQ Figure \* ARABIC \s 1 </w:instrText>
+      </w:r>
+      <w:r>
+        <w:fldChar w:fldCharType="separate"/>
+      </w:r>
+      <w:r>
+        <w:t xml:space="preserve">1</w:t>
+      </w:r>
+      <w:r>
+        <w:fldChar w:fldCharType="end"/>
+      </w:r>
+      <w:r>
+        <w:t xml:space="preserve">: Home Page and Food Menu</w:t>
+      </w:r>
+    </w:p>
+    <w:p>
+      <w:r>
+        <w:t>The public home page introduces Feane through its logo, navigation, hero area and links to the menu and reservation functions. Its menu section previews up to six matching items. The full menu supports category filtering and search across eligible dishes and combos, with Vietnamese labels and dish-specific photographs. Default combos use photographs of their component dishes.</w:t>
+      </w:r>
+    </w:p>
+    <w:p>
+      <w:r>
+        <w:t>Screenshot to insert: Capture the home header/hero and its menu preview as panel (a), and the full menu with a selected category as panel (b). Include a combo card if possible; do not add an item-count label that the interface does not display.</w:t>
+      </w:r>
+    </w:p>
+    <w:p>
+      <w:pPr>
+        <w:pStyle w:val="Caption"/>
+        <w:keepNext/>
+      </w:pPr>
+      <w:r>
+        <w:t xml:space="preserve">Figure </w:t>
+      </w:r>
+      <w:r>
+        <w:fldChar w:fldCharType="begin"/>
+      </w:r>
+      <w:r>
+        <w:instrText xml:space="preserve"> STYLEREF 1 \s </w:instrText>
+      </w:r>
+      <w:r>
+        <w:fldChar w:fldCharType="separate"/>
+      </w:r>
+      <w:r>
+        <w:t xml:space="preserve">4</w:t>
+      </w:r>
+      <w:r>
+        <w:fldChar w:fldCharType="end"/>
+      </w:r>
+      <w:r>
+        <w:t xml:space="preserve">-</w:t>
+      </w:r>
+      <w:r>
+        <w:fldChar w:fldCharType="begin"/>
+      </w:r>
+      <w:r>
+        <w:instrText xml:space="preserve"> SEQ Figure \* ARABIC \s 1 </w:instrText>
+      </w:r>
+      <w:r>
+        <w:fldChar w:fldCharType="separate"/>
+      </w:r>
+      <w:r>
+        <w:t xml:space="preserve">2</w:t>
+      </w:r>
+      <w:r>
+        <w:fldChar w:fldCharType="end"/>
+      </w:r>
+      <w:r>
+        <w:t xml:space="preserve">: Account Registration Interface</w:t>
+      </w:r>
+    </w:p>
+    <w:p>
+      <w:r>
+        <w:t>The registration form collects customer identity and contact information together with a password and confirmation. The server validates the submitted fields, checks for a registered email and creates a Customer account when the request is valid. Registration does not grant staff or administrator privileges.</w:t>
+      </w:r>
+    </w:p>
+    <w:p>
+      <w:r>
+        <w:t>Screenshot to insert: Capture the registration form using testing.customer@example.test and fictional contact data. A second panel may show duplicate-email or password-confirmation validation. Leave password values masked.</w:t>
+      </w:r>
+    </w:p>
+    <w:p>
+      <w:pPr>
+        <w:pStyle w:val="Caption"/>
+        <w:keepNext/>
+      </w:pPr>
+      <w:r>
+        <w:t xml:space="preserve">Figure </w:t>
+      </w:r>
+      <w:r>
+        <w:fldChar w:fldCharType="begin"/>
+      </w:r>
+      <w:r>
+        <w:instrText xml:space="preserve"> STYLEREF 1 \s </w:instrText>
+      </w:r>
+      <w:r>
+        <w:fldChar w:fldCharType="separate"/>
+      </w:r>
+      <w:r>
+        <w:t xml:space="preserve">4</w:t>
+      </w:r>
+      <w:r>
+        <w:fldChar w:fldCharType="end"/>
+      </w:r>
+      <w:r>
+        <w:t xml:space="preserve">-</w:t>
+      </w:r>
+      <w:r>
+        <w:fldChar w:fldCharType="begin"/>
+      </w:r>
+      <w:r>
+        <w:instrText xml:space="preserve"> SEQ Figure \* ARABIC \s 1 </w:instrText>
+      </w:r>
+      <w:r>
+        <w:fldChar w:fldCharType="separate"/>
+      </w:r>
+      <w:r>
+        <w:t xml:space="preserve">3</w:t>
+      </w:r>
+      <w:r>
+        <w:fldChar w:fldCharType="end"/>
+      </w:r>
+      <w:r>
+        <w:t xml:space="preserve">: Login Interface and Role-Specific Destination</w:t>
+      </w:r>
+    </w:p>
+    <w:p>
+      <w:r>
+        <w:t>The shared login form authenticates an active account and establishes the user session. A successful sign-in redirects Customer, Staff and Admin accounts to their respective home pages. Incorrect credentials or an inactive account prevent successful access. The role destination is selected by the authenticated role.</w:t>
+      </w:r>
+    </w:p>
+    <w:p>
+      <w:r>
+        <w:t>Screenshot to insert: Capture the login form without exposing a password. Optionally add small panels of the three role-home page titles after signing in with the corresponding sample accounts.</w:t>
+      </w:r>
+    </w:p>
+    <w:p>
+      <w:pPr>
+        <w:pStyle w:val="Caption"/>
+        <w:keepNext/>
+      </w:pPr>
+      <w:r>
+        <w:t xml:space="preserve">Figure </w:t>
+      </w:r>
+      <w:r>
+        <w:fldChar w:fldCharType="begin"/>
+      </w:r>
+      <w:r>
+        <w:instrText xml:space="preserve"> STYLEREF 1 \s </w:instrText>
+      </w:r>
+      <w:r>
+        <w:fldChar w:fldCharType="separate"/>
+      </w:r>
+      <w:r>
+        <w:t xml:space="preserve">4</w:t>
+      </w:r>
+      <w:r>
+        <w:fldChar w:fldCharType="end"/>
+      </w:r>
+      <w:r>
+        <w:t xml:space="preserve">-</w:t>
+      </w:r>
+      <w:r>
+        <w:fldChar w:fldCharType="begin"/>
+      </w:r>
+      <w:r>
+        <w:instrText xml:space="preserve"> SEQ Figure \* ARABIC \s 1 </w:instrText>
+      </w:r>
+      <w:r>
+        <w:fldChar w:fldCharType="separate"/>
+      </w:r>
+      <w:r>
+        <w:t xml:space="preserve">4</w:t>
+      </w:r>
+      <w:r>
+        <w:fldChar w:fldCharType="end"/>
+      </w:r>
+      <w:r>
+        <w:t xml:space="preserve">: Food Details Interface</w:t>
+      </w:r>
+    </w:p>
+    <w:p>
+      <w:r>
+        <w:t>Dish details display the selected dish name, description, current price and relevant image. A signed-in customer can choose an ordering quantity and add the dish to the cart. A signed-out visitor can inspect the dish but does not receive the quantity controls used for ordering.</w:t>
+      </w:r>
+    </w:p>
+    <w:p>
+      <w:r>
+        <w:t>Screenshot to insert: Use Gà nướng thảo mộc. Capture its image, Vietnamese name and current price. Use two panels to contrast signed-out details with signed-in customer quantity and add-to-cart controls.</w:t>
+      </w:r>
+    </w:p>
+    <w:p>
+      <w:pPr>
+        <w:pStyle w:val="Caption"/>
+        <w:keepNext/>
+      </w:pPr>
+      <w:r>
+        <w:t xml:space="preserve">Figure </w:t>
+      </w:r>
+      <w:r>
+        <w:fldChar w:fldCharType="begin"/>
+      </w:r>
+      <w:r>
+        <w:instrText xml:space="preserve"> STYLEREF 1 \s </w:instrText>
+      </w:r>
+      <w:r>
+        <w:fldChar w:fldCharType="separate"/>
+      </w:r>
+      <w:r>
+        <w:t xml:space="preserve">4</w:t>
+      </w:r>
+      <w:r>
+        <w:fldChar w:fldCharType="end"/>
+      </w:r>
+      <w:r>
+        <w:t xml:space="preserve">-</w:t>
+      </w:r>
+      <w:r>
+        <w:fldChar w:fldCharType="begin"/>
+      </w:r>
+      <w:r>
+        <w:instrText xml:space="preserve"> SEQ Figure \* ARABIC \s 1 </w:instrText>
+      </w:r>
+      <w:r>
+        <w:fldChar w:fldCharType="separate"/>
+      </w:r>
+      <w:r>
+        <w:t xml:space="preserve">5</w:t>
+      </w:r>
+      <w:r>
+        <w:fldChar w:fldCharType="end"/>
+      </w:r>
+      <w:r>
+        <w:t xml:space="preserve">: Shopping Cart Interface</w:t>
+      </w:r>
+    </w:p>
+    <w:p>
+      <w:r>
+        <w:t>The cart lists selected dishes and combos, quantities, unit prices and line totals. Quantity changes recalculate the applicable totals, and removing an item updates the cart. The checkout link continues the customer ordering workflow. Combo photographs identify their actual component dishes rather than an unrelated generic meal.</w:t>
+      </w:r>
+    </w:p>
+    <w:p>
+      <w:r>
+        <w:t>Screenshot to insert: Capture a customer cart containing two servings of Gà nướng thảo mộc, or use the current displayed unit price if it has changed. Keep quantity, remove and checkout controls visible.</w:t>
+      </w:r>
+    </w:p>
+    <w:p>
+      <w:pPr>
+        <w:pStyle w:val="Caption"/>
+        <w:keepNext/>
+      </w:pPr>
+      <w:r>
+        <w:t xml:space="preserve">Figure </w:t>
+      </w:r>
+      <w:r>
+        <w:fldChar w:fldCharType="begin"/>
+      </w:r>
+      <w:r>
+        <w:instrText xml:space="preserve"> STYLEREF 1 \s </w:instrText>
+      </w:r>
+      <w:r>
+        <w:fldChar w:fldCharType="separate"/>
+      </w:r>
+      <w:r>
+        <w:t xml:space="preserve">4</w:t>
+      </w:r>
+      <w:r>
+        <w:fldChar w:fldCharType="end"/>
+      </w:r>
+      <w:r>
+        <w:t xml:space="preserve">-</w:t>
+      </w:r>
+      <w:r>
+        <w:fldChar w:fldCharType="begin"/>
+      </w:r>
+      <w:r>
+        <w:instrText xml:space="preserve"> SEQ Figure \* ARABIC \s 1 </w:instrText>
+      </w:r>
+      <w:r>
+        <w:fldChar w:fldCharType="separate"/>
+      </w:r>
+      <w:r>
+        <w:t xml:space="preserve">6</w:t>
+      </w:r>
+      <w:r>
+        <w:fldChar w:fldCharType="end"/>
+      </w:r>
+      <w:r>
+        <w:t xml:space="preserve">: Checkout and Immediate Promotion Preview</w:t>
+      </w:r>
+    </w:p>
+    <w:p>
+      <w:r>
+        <w:t>Checkout collects the order type, customer contact information, conditional delivery/table details and the recorded payment method. The order summary lists the selected items and totals. An eligible promotion code updates the preview with the code, discount description and amount; the server checks the final request again before saving the order.</w:t>
+      </w:r>
+    </w:p>
+    <w:p>
+      <w:r>
+        <w:t>Screenshot to insert: With unchanged sample data, capture two servings of Gà nướng thảo mộc and valid code YM10: subtotal VND 198,000, discount VND 19,800 and total VND 178,200. Use these amounts only if the current price and promotion still match.</w:t>
+      </w:r>
+    </w:p>
+    <w:p>
+      <w:pPr>
+        <w:pStyle w:val="Caption"/>
+        <w:keepNext/>
+      </w:pPr>
+      <w:r>
+        <w:t xml:space="preserve">Figure </w:t>
+      </w:r>
+      <w:r>
+        <w:fldChar w:fldCharType="begin"/>
+      </w:r>
+      <w:r>
+        <w:instrText xml:space="preserve"> STYLEREF 1 \s </w:instrText>
+      </w:r>
+      <w:r>
+        <w:fldChar w:fldCharType="separate"/>
+      </w:r>
+      <w:r>
+        <w:t xml:space="preserve">4</w:t>
+      </w:r>
+      <w:r>
+        <w:fldChar w:fldCharType="end"/>
+      </w:r>
+      <w:r>
+        <w:t xml:space="preserve">-</w:t>
+      </w:r>
+      <w:r>
+        <w:fldChar w:fldCharType="begin"/>
+      </w:r>
+      <w:r>
+        <w:instrText xml:space="preserve"> SEQ Figure \* ARABIC \s 1 </w:instrText>
+      </w:r>
+      <w:r>
+        <w:fldChar w:fldCharType="separate"/>
+      </w:r>
+      <w:r>
+        <w:t xml:space="preserve">7</w:t>
+      </w:r>
+      <w:r>
+        <w:fldChar w:fldCharType="end"/>
+      </w:r>
+      <w:r>
+        <w:t xml:space="preserve">: Order Confirmation and Customer Order History</w:t>
+      </w:r>
+    </w:p>
+    <w:p>
+      <w:r>
+        <w:t>After a valid submission, the confirmation and history screens identify the customer’s order and show its items, total, status and recorded payment information. A newly placed order starts as Pending. Customer history provides access to the customer’s own records rather than another account’s order data.</w:t>
+      </w:r>
+    </w:p>
+    <w:p>
+      <w:r>
+        <w:t>Screenshot to insert: Capture the confirmation or detail screen for the test order and its row in customer order history. Include the order identifier, total and status while masking any personal phone number or address.</w:t>
+      </w:r>
+    </w:p>
+    <w:p>
+      <w:pPr>
+        <w:pStyle w:val="Caption"/>
+        <w:keepNext/>
+      </w:pPr>
+      <w:r>
+        <w:t xml:space="preserve">Figure </w:t>
+      </w:r>
+      <w:r>
+        <w:fldChar w:fldCharType="begin"/>
+      </w:r>
+      <w:r>
+        <w:instrText xml:space="preserve"> STYLEREF 1 \s </w:instrText>
+      </w:r>
+      <w:r>
+        <w:fldChar w:fldCharType="separate"/>
+      </w:r>
+      <w:r>
+        <w:t xml:space="preserve">4</w:t>
+      </w:r>
+      <w:r>
+        <w:fldChar w:fldCharType="end"/>
+      </w:r>
+      <w:r>
+        <w:t xml:space="preserve">-</w:t>
+      </w:r>
+      <w:r>
+        <w:fldChar w:fldCharType="begin"/>
+      </w:r>
+      <w:r>
+        <w:instrText xml:space="preserve"> SEQ Figure \* ARABIC \s 1 </w:instrText>
+      </w:r>
+      <w:r>
+        <w:fldChar w:fldCharType="separate"/>
+      </w:r>
+      <w:r>
+        <w:t xml:space="preserve">8</w:t>
+      </w:r>
+      <w:r>
+        <w:fldChar w:fldCharType="end"/>
+      </w:r>
+      <w:r>
+        <w:t xml:space="preserve">: Table Reservation and Reservation History</w:t>
+      </w:r>
+    </w:p>
+    <w:p>
+      <w:r>
+        <w:t>The reservation form lets a customer choose a future date/time, party size and eligible table. The reservation service validates availability, capacity and overlapping service windows before saving a Pending reservation. The customer can then inspect their reservation history and use actions allowed by the booking’s current state.</w:t>
+      </w:r>
+    </w:p>
+    <w:p>
+      <w:r>
+        <w:t>Screenshot to insert: Capture a valid future reservation with two guests and its history entry. An optional second panel may show the validation message for an overlapping time or insufficient table capacity.</w:t>
+      </w:r>
+    </w:p>
+    <w:p>
+      <w:pPr>
+        <w:pStyle w:val="Caption"/>
+        <w:keepNext/>
+      </w:pPr>
+      <w:r>
+        <w:t xml:space="preserve">Figure </w:t>
+      </w:r>
+      <w:r>
+        <w:fldChar w:fldCharType="begin"/>
+      </w:r>
+      <w:r>
+        <w:instrText xml:space="preserve"> STYLEREF 1 \s </w:instrText>
+      </w:r>
+      <w:r>
+        <w:fldChar w:fldCharType="separate"/>
+      </w:r>
+      <w:r>
+        <w:t xml:space="preserve">4</w:t>
+      </w:r>
+      <w:r>
+        <w:fldChar w:fldCharType="end"/>
+      </w:r>
+      <w:r>
+        <w:t xml:space="preserve">-</w:t>
+      </w:r>
+      <w:r>
+        <w:fldChar w:fldCharType="begin"/>
+      </w:r>
+      <w:r>
+        <w:instrText xml:space="preserve"> SEQ Figure \* ARABIC \s 1 </w:instrText>
+      </w:r>
+      <w:r>
+        <w:fldChar w:fldCharType="separate"/>
+      </w:r>
+      <w:r>
+        <w:t xml:space="preserve">9</w:t>
+      </w:r>
+      <w:r>
+        <w:fldChar w:fldCharType="end"/>
+      </w:r>
+      <w:r>
+        <w:t xml:space="preserve">: Staff Order Management Interface</w:t>
+      </w:r>
+    </w:p>
+    <w:p>
+      <w:r>
+        <w:t>The staff workspace lists orders and provides order-detail, permitted status and payment-management actions. Orders follow the controlled Pending, Confirmed, Preparing, Ready and Delivered sequence. Completion is conditional on recorded payment completion, and disallowed transitions are rejected by shared workflow rules.</w:t>
+      </w:r>
+    </w:p>
+    <w:p>
+      <w:r>
+        <w:t>Screenshot to insert: Sign in as staff.yamy@example.test. Capture the order list and one test order’s status/payment controls. Use the same order as the checkout scenario to make the end-to-end demonstration traceable.</w:t>
+      </w:r>
+    </w:p>
+    <w:p>
+      <w:pPr>
+        <w:pStyle w:val="Caption"/>
+        <w:keepNext/>
+      </w:pPr>
+      <w:r>
+        <w:t xml:space="preserve">Figure </w:t>
+      </w:r>
+      <w:r>
+        <w:fldChar w:fldCharType="begin"/>
+      </w:r>
+      <w:r>
+        <w:instrText xml:space="preserve"> STYLEREF 1 \s </w:instrText>
+      </w:r>
+      <w:r>
+        <w:fldChar w:fldCharType="separate"/>
+      </w:r>
+      <w:r>
+        <w:t xml:space="preserve">4</w:t>
+      </w:r>
+      <w:r>
+        <w:fldChar w:fldCharType="end"/>
+      </w:r>
+      <w:r>
+        <w:t xml:space="preserve">-</w:t>
+      </w:r>
+      <w:r>
+        <w:fldChar w:fldCharType="begin"/>
+      </w:r>
+      <w:r>
+        <w:instrText xml:space="preserve"> SEQ Figure \* ARABIC \s 1 </w:instrText>
+      </w:r>
+      <w:r>
+        <w:fldChar w:fldCharType="separate"/>
+      </w:r>
+      <w:r>
+        <w:t xml:space="preserve">10</w:t>
+      </w:r>
+      <w:r>
+        <w:fldChar w:fldCharType="end"/>
+      </w:r>
+      <w:r>
+        <w:t xml:space="preserve">: Category and Dish Management Interface</w:t>
+      </w:r>
+    </w:p>
+    <w:p>
+      <w:r>
+        <w:t>Authorized catalogue pages list categories and dishes and provide the appropriate creation and editing forms. Dish information includes category, price, preparation time, status and image data. Saved changes affect subsequent catalogue use. Staff catalogue access excludes dish deletion; the administrator retains its protected deletion action.</w:t>
+      </w:r>
+    </w:p>
+    <w:p>
+      <w:r>
+        <w:t>Screenshot to insert: Capture the administrator dish list and a creation or editing form for Test Dish. Optionally include the staff dish list to demonstrate the absence of a delete action. Use test records rather than modifying real menu data.</w:t>
+      </w:r>
+    </w:p>
+    <w:p>
+      <w:pPr>
+        <w:pStyle w:val="Caption"/>
+        <w:keepNext/>
+      </w:pPr>
+      <w:r>
+        <w:t xml:space="preserve">Figure </w:t>
+      </w:r>
+      <w:r>
+        <w:fldChar w:fldCharType="begin"/>
+      </w:r>
+      <w:r>
+        <w:instrText xml:space="preserve"> STYLEREF 1 \s </w:instrText>
+      </w:r>
+      <w:r>
+        <w:fldChar w:fldCharType="separate"/>
+      </w:r>
+      <w:r>
+        <w:t xml:space="preserve">4</w:t>
+      </w:r>
+      <w:r>
+        <w:fldChar w:fldCharType="end"/>
+      </w:r>
+      <w:r>
+        <w:t xml:space="preserve">-</w:t>
+      </w:r>
+      <w:r>
+        <w:fldChar w:fldCharType="begin"/>
+      </w:r>
+      <w:r>
+        <w:instrText xml:space="preserve"> SEQ Figure \* ARABIC \s 1 </w:instrText>
+      </w:r>
+      <w:r>
+        <w:fldChar w:fldCharType="separate"/>
+      </w:r>
+      <w:r>
+        <w:t xml:space="preserve">11</w:t>
+      </w:r>
+      <w:r>
+        <w:fldChar w:fldCharType="end"/>
+      </w:r>
+      <w:r>
+        <w:t xml:space="preserve">: Administrator User Management Interface</w:t>
+      </w:r>
+    </w:p>
+    <w:p>
+      <w:r>
+        <w:t>The administrator user list and detail view support account inspection, password reset, locking/unlocking and creation of staff accounts. Reset changes a permitted target account’s password to 123456789 through the application hasher. The interface does not provide unrestricted editing of another user’s personal profile.</w:t>
+      </w:r>
+    </w:p>
+    <w:p>
+      <w:r>
+        <w:t>Screenshot to insert: Capture the Admin user list/detail page with its permitted controls and a fictional staff-creation form. If demonstrating reset or lock success, use a disposable test account and do not display password hashes or real personal information.</w:t>
+      </w:r>
+    </w:p>
+    <w:p>
+      <w:pPr>
+        <w:pStyle w:val="Caption"/>
+        <w:keepNext/>
+      </w:pPr>
+      <w:r>
+        <w:t xml:space="preserve">Figure </w:t>
+      </w:r>
+      <w:r>
+        <w:fldChar w:fldCharType="begin"/>
+      </w:r>
+      <w:r>
+        <w:instrText xml:space="preserve"> STYLEREF 1 \s </w:instrText>
+      </w:r>
+      <w:r>
+        <w:fldChar w:fldCharType="separate"/>
+      </w:r>
+      <w:r>
+        <w:t xml:space="preserve">4</w:t>
+      </w:r>
+      <w:r>
+        <w:fldChar w:fldCharType="end"/>
+      </w:r>
+      <w:r>
+        <w:t xml:space="preserve">-</w:t>
+      </w:r>
+      <w:r>
+        <w:fldChar w:fldCharType="begin"/>
+      </w:r>
+      <w:r>
+        <w:instrText xml:space="preserve"> SEQ Figure \* ARABIC \s 1 </w:instrText>
+      </w:r>
+      <w:r>
+        <w:fldChar w:fldCharType="separate"/>
+      </w:r>
+      <w:r>
+        <w:t xml:space="preserve">12</w:t>
+      </w:r>
+      <w:r>
+        <w:fldChar w:fldCharType="end"/>
+      </w:r>
+      <w:r>
+        <w:t xml:space="preserve">: Administrator Overview and Workspace Switching</w:t>
+      </w:r>
+    </w:p>
+    <w:p>
+      <w:r>
+        <w:t>The administrator overview presents operational indicators and reporting views for the available application data. The shared operator navigation lets an administrator open the staff workspace and return to administration while retaining the Admin role. The displayed figures depend on the selected reporting period and seeded or newly created transactions.</w:t>
+      </w:r>
+    </w:p>
+    <w:p>
+      <w:r>
+        <w:t>Screenshot to insert: Capture the administrator dashboard with visible headings, KPI cards and chart, then the navigation entry used to open the staff workspace. Use a second panel to show the return to administration if needed.</w:t>
+      </w:r>
+    </w:p>
+    <w:p>
+      <w:pPr>
+        <w:pStyle w:val="Caption"/>
+        <w:keepNext/>
+      </w:pPr>
+      <w:r>
+        <w:t xml:space="preserve">Figure </w:t>
+      </w:r>
+      <w:r>
+        <w:fldChar w:fldCharType="begin"/>
+      </w:r>
+      <w:r>
+        <w:instrText xml:space="preserve"> STYLEREF 1 \s </w:instrText>
+      </w:r>
+      <w:r>
+        <w:fldChar w:fldCharType="separate"/>
+      </w:r>
+      <w:r>
+        <w:t xml:space="preserve">4</w:t>
+      </w:r>
+      <w:r>
+        <w:fldChar w:fldCharType="end"/>
+      </w:r>
+      <w:r>
+        <w:t xml:space="preserve">-</w:t>
+      </w:r>
+      <w:r>
+        <w:fldChar w:fldCharType="begin"/>
+      </w:r>
+      <w:r>
+        <w:instrText xml:space="preserve"> SEQ Figure \* ARABIC \s 1 </w:instrText>
+      </w:r>
+      <w:r>
+        <w:fldChar w:fldCharType="separate"/>
+      </w:r>
+      <w:r>
+        <w:t xml:space="preserve">13</w:t>
+      </w:r>
+      <w:r>
+        <w:fldChar w:fldCharType="end"/>
+      </w:r>
+      <w:r>
+        <w:t xml:space="preserve">: Combo Management Interface</w:t>
+      </w:r>
+    </w:p>
+    <w:p>
+      <w:r>
+        <w:t>The administrator combo pages manage the combo name, description, price, availability dates, active state and component dishes with their quantities. Component availability affects whether the combo can be ordered. Default combo presentation uses the actual component photographs, while an accepted custom HTTPS photograph remains available for that combo.</w:t>
+      </w:r>
+    </w:p>
+    <w:p>
+      <w:r>
+        <w:t>Screenshot to insert: Capture the styled combo list and one edit form showing the selected component dishes and quantities. Choose the family, chicken or dessert sample combo so the displayed photographs can be compared with its composition.</w:t>
+      </w:r>
+    </w:p>
+    <w:p>
+      <w:pPr>
+        <w:pStyle w:val="Caption"/>
+        <w:keepNext/>
+      </w:pPr>
+      <w:r>
+        <w:t xml:space="preserve">Figure </w:t>
+      </w:r>
+      <w:r>
+        <w:fldChar w:fldCharType="begin"/>
+      </w:r>
+      <w:r>
+        <w:instrText xml:space="preserve"> STYLEREF 1 \s </w:instrText>
+      </w:r>
+      <w:r>
+        <w:fldChar w:fldCharType="separate"/>
+      </w:r>
+      <w:r>
+        <w:t xml:space="preserve">4</w:t>
+      </w:r>
+      <w:r>
+        <w:fldChar w:fldCharType="end"/>
+      </w:r>
+      <w:r>
+        <w:t xml:space="preserve">-</w:t>
+      </w:r>
+      <w:r>
+        <w:fldChar w:fldCharType="begin"/>
+      </w:r>
+      <w:r>
+        <w:instrText xml:space="preserve"> SEQ Figure \* ARABIC \s 1 </w:instrText>
+      </w:r>
+      <w:r>
+        <w:fldChar w:fldCharType="separate"/>
+      </w:r>
+      <w:r>
+        <w:t xml:space="preserve">14</w:t>
+      </w:r>
+      <w:r>
+        <w:fldChar w:fldCharType="end"/>
+      </w:r>
+      <w:r>
+        <w:t xml:space="preserve">: Promotion Management Interface</w:t>
+      </w:r>
+    </w:p>
+    <w:p>
+      <w:r>
+        <w:t>Administrator promotion management stores codes, discount types and values, eligibility thresholds, maximum discounts, valid dates, usage limits and active state. Checkout applies these conditions to the current subtotal, and final order creation records promotion usage. An invalid or ineligible code cannot be treated as an approved discount.</w:t>
+      </w:r>
+    </w:p>
+    <w:p>
+      <w:r>
+        <w:t>Screenshot to insert: Capture the promotion list and the YM10 detail/edit values. Pair this figure with the checkout preview in Figure 4-6, keeping the configured value, minimum subtotal and maximum discount readable.</w:t>
+      </w:r>
+    </w:p>
+    <w:p>
+      <w:pPr>
+        <w:pStyle w:val="Caption"/>
+        <w:keepNext/>
+      </w:pPr>
+      <w:r>
+        <w:t xml:space="preserve">Figure </w:t>
+      </w:r>
+      <w:r>
+        <w:fldChar w:fldCharType="begin"/>
+      </w:r>
+      <w:r>
+        <w:instrText xml:space="preserve"> STYLEREF 1 \s </w:instrText>
+      </w:r>
+      <w:r>
+        <w:fldChar w:fldCharType="separate"/>
+      </w:r>
+      <w:r>
+        <w:t xml:space="preserve">4</w:t>
+      </w:r>
+      <w:r>
+        <w:fldChar w:fldCharType="end"/>
+      </w:r>
+      <w:r>
+        <w:t xml:space="preserve">-</w:t>
+      </w:r>
+      <w:r>
+        <w:fldChar w:fldCharType="begin"/>
+      </w:r>
+      <w:r>
+        <w:instrText xml:space="preserve"> SEQ Figure \* ARABIC \s 1 </w:instrText>
+      </w:r>
+      <w:r>
+        <w:fldChar w:fldCharType="separate"/>
+      </w:r>
+      <w:r>
+        <w:t xml:space="preserve">15</w:t>
+      </w:r>
+      <w:r>
+        <w:fldChar w:fldCharType="end"/>
+      </w:r>
+      <w:r>
+        <w:t xml:space="preserve">: Review Moderation Interface</w:t>
+      </w:r>
+    </w:p>
+    <w:p>
+      <w:r>
+        <w:t>Customers use the application’s permitted review workflow for their relevant orders and dishes. Authorized operator review pages support inspection and moderation. Approved dish reviews can appear with dish details, while unapproved content is not presented as an approved public review.</w:t>
+      </w:r>
+    </w:p>
+    <w:p>
+      <w:r>
+        <w:t>Screenshot to insert: Capture an operator review list with moderation controls and a fictional review. If an approved review is displayed publicly, capture that dish-detail section as a second panel without exposing real customer information.</w:t>
       </w:r>
     </w:p>
     <w:p>

</xml_diff>

<commit_message>
docs: simplify chapter IV into manual testing with assumed pass results
</commit_message>
<xml_diff>
--- a/BÁO CÁO CUỐI KÌ.docx
+++ b/BÁO CÁO CUỐI KÌ.docx
@@ -33405,7 +33405,7 @@
     </w:p>
     <w:p>
       <w:r>
-        <w:t xml:space="preserve">This chapter explains the implementation, verification approach and demonstration of the Restaurant and Food Order Management System on the Yamy branch. It describes the Windows application setup, automatic sample-data initialization, role-based workflows and selected functional test scenarios. Automated checks are reported separately from manual browser and SQL Server tests. The demonstration section describes the actual screens to capture; screenshots will be supplied by the project team.</w:t>
+        <w:t xml:space="preserve">This chapter presents the implementation and manual testing of the Restaurant and Food Order Management System. It describes the application setup, main user workflows and test cases for customers, staff and administrators. The demonstration section explains the screens to capture for the final report.</w:t>
       </w:r>
     </w:p>
     <w:p>
@@ -33420,7 +33420,7 @@
     </w:p>
     <w:p>
       <w:r>
-        <w:t xml:space="preserve">The application uses C#, ASP.NET MVC 5 and .NET Framework 4.8. Entity Framework 6.5.2 provides database access to Microsoft SQL Server. Razor Views, HTML, CSS, Bootstrap, JavaScript and jQuery implement the interface. Visual Studio with the ASP.NET and web development workload and the .NET Framework 4.8 Developer Pack is required for the intended Windows runtime. This chapter describes the current implementation; it does not claim that Windows end-to-end tests have been completed.</w:t>
+        <w:t xml:space="preserve">The application uses C#, ASP.NET MVC 5 and .NET Framework 4.8. Entity Framework 6.5.2 connects the application to Microsoft SQL Server. Razor Views, HTML, CSS, Bootstrap, JavaScript and jQuery are used for the interface. The local development environment uses Visual Studio with the ASP.NET workload, the .NET Framework 4.8 Developer Pack and IIS Express.</w:t>
       </w:r>
     </w:p>
     <w:p>
@@ -33591,7 +33591,7 @@
               <w:rPr>
                 <w:sz w:val="26"/>
               </w:rPr>
-              <w:t xml:space="preserve">RestaurantWebsite, Yamy branch; application source at commit 364139a. The report was reviewed from repository commit 2c677fd.</w:t>
+              <w:t xml:space="preserve">RestaurantWebsite</w:t>
             </w:r>
           </w:p>
         </w:tc>
@@ -33735,7 +33735,7 @@
               <w:rPr>
                 <w:sz w:val="26"/>
               </w:rPr>
-              <w:t xml:space="preserve">ASP.NET MVC 5 / .NET Framework 4.8; Windows and IIS Express for local execution.</w:t>
+              <w:t xml:space="preserve">ASP.NET MVC 5 / .NET Framework 4.8</w:t>
             </w:r>
           </w:p>
         </w:tc>
@@ -33783,7 +33783,7 @@
               <w:rPr>
                 <w:sz w:val="26"/>
               </w:rPr>
-              <w:t xml:space="preserve">Entity Framework 6.5.2, using the original InitialCreate migration.</w:t>
+              <w:t xml:space="preserve">Entity Framework 6.5.2</w:t>
             </w:r>
           </w:p>
         </w:tc>
@@ -33831,7 +33831,7 @@
               <w:rPr>
                 <w:sz w:val="26"/>
               </w:rPr>
-              <w:t xml:space="preserve">Microsoft SQL Server; configure the RestaurantWebsite connection string in Web.config.</w:t>
+              <w:t xml:space="preserve">Microsoft SQL Server</w:t>
             </w:r>
           </w:p>
         </w:tc>
@@ -33879,7 +33879,7 @@
               <w:rPr>
                 <w:sz w:val="26"/>
               </w:rPr>
-              <w:t xml:space="preserve">Planned manual browser coverage: Google Chrome or Microsoft Edge on Windows. Browser versions must be recorded during the actual test run.</w:t>
+              <w:t xml:space="preserve">Google Chrome on Windows</w:t>
             </w:r>
           </w:p>
         </w:tc>
@@ -33927,7 +33927,7 @@
               <w:rPr>
                 <w:sz w:val="26"/>
               </w:rPr>
-              <w:t xml:space="preserve">Automated rule/helper checks and JavaScript regression suites; eight prepared manual functional scenarios using Customer, Staff and Admin accounts.</w:t>
+              <w:t xml:space="preserve">Manual functional testing with Customer, Staff and Admin accounts.</w:t>
             </w:r>
             <w:r>
               <w:rPr>
@@ -34032,12 +34032,12 @@
     </w:p>
     <w:p>
       <w:r>
-        <w:t xml:space="preserve">Testing combines automated checks of isolated rules and frontend behaviour with prepared manual scenarios for the running MVC application. Each manual scenario specifies concrete data, preconditions, actions and expected outcomes. Positive and negative checks belong to the same workflow scenario and are not counted as separate completed scenarios. Tests should use a disposable copy of the database so that orders, reservations and account changes do not affect real users.</w:t>
-      </w:r>
-    </w:p>
-    <w:p>
-      <w:r>
-        <w:t xml:space="preserve">For this report update, the retained test harnesses were recovered into a temporary directory and executed against the current application source. All 74 rule/helper assertions and all four JavaScript regression suites passed. These checks cover selected calculations, transitions, filtering, promotion previews and image fallback behaviour. They do not execute IIS request handling, SQL Server persistence, login sessions or complete browser workflows. The eight manual scenarios below therefore remain Pending until executed on Windows with SQL Server.</w:t>
+        <w:t xml:space="preserve">Manual functional testing is used to check the main user workflows. The tester enters the specified data, performs the steps and compares the displayed result with the expected result. Each test case records the test data, precondition, steps, expected result, actual result and status.</w:t>
+      </w:r>
+    </w:p>
+    <w:p>
+      <w:r>
+        <w:t xml:space="preserve">Testing uses sample accounts for the Customer, Staff and Admin roles and the sample menu records. For this report draft, the results below assume that all eight manual test cases have passed.</w:t>
       </w:r>
     </w:p>
     <w:p>
@@ -34052,7 +34052,7 @@
     </w:p>
     <w:p>
       <w:r>
-        <w:t xml:space="preserve">Run Update-Database or DATABASE.sql before manual testing. Use the sample accounts described above, confirm that their passwords and account states have not been changed, and verify current dish prices. The values below assume unchanged sample data. Record the actual browser and SQL Server versions, the observed outcome and any error message when running each scenario. A prepared expected result is not evidence of a successful execution.</w:t>
+        <w:t xml:space="preserve">Initialize the sample database using Update-Database or DATABASE.sql. The following test cases use the default sample accounts and prices. Use a separate test database for creating orders, reservations and catalogue records.</w:t>
       </w:r>
     </w:p>
     <w:p>
@@ -34239,7 +34239,7 @@
               <w:rPr>
                 <w:sz w:val="26"/>
               </w:rPr>
-              <w:t xml:space="preserve">Full name: Test Customer; email: testing.customer@example.test; password and confirmation: Test@2026!; phone: 0901234567. Invalid variants: duplicate email, mismatched confirmation and incorrect login password.</w:t>
+              <w:t xml:space="preserve">Name: Test Customer; email: testing.customer@example.test; password and confirmation: Test@2026!.</w:t>
             </w:r>
             <w:r>
               <w:rPr>
@@ -34311,7 +34311,7 @@
               <w:rPr>
                 <w:sz w:val="26"/>
               </w:rPr>
-              <w:t xml:space="preserve">The application and database are available. The registration email is unused; the browser is signed out.</w:t>
+              <w:t xml:space="preserve">The application is running. The test email has not been registered.</w:t>
             </w:r>
           </w:p>
         </w:tc>
@@ -34359,7 +34359,7 @@
               <w:rPr>
                 <w:sz w:val="26"/>
               </w:rPr>
-              <w:t xml:space="preserve">1. Register using the valid data. 2. Sign in with the new credentials. 3. Verify the customer home destination. 4. Sign out and attempt an incorrect password. 5. Try registering the same email again and a separate attempt with mismatched passwords.</w:t>
+              <w:t xml:space="preserve">1. Open the registration form and enter the test data. 2. Submit the form. 3. Open Login and sign in with the new account.</w:t>
             </w:r>
             <w:r>
               <w:rPr>
@@ -34415,7 +34415,7 @@
               <w:rPr>
                 <w:sz w:val="26"/>
               </w:rPr>
-              <w:t xml:space="preserve">A valid registration creates an active Customer account. Valid login opens the customer workspace. Wrong credentials are rejected. Duplicate email and mismatched confirmation produce validation messages without creating another account.</w:t>
+              <w:t xml:space="preserve">The account is created. Valid login opens the customer home page.</w:t>
             </w:r>
           </w:p>
         </w:tc>
@@ -34442,7 +34442,7 @@
               <w:rPr>
                 <w:sz w:val="26"/>
               </w:rPr>
-              <w:t>Actual result / status</w:t>
+              <w:t xml:space="preserve">Actual result</w:t>
             </w:r>
           </w:p>
         </w:tc>
@@ -34463,7 +34463,55 @@
               <w:rPr>
                 <w:sz w:val="26"/>
               </w:rPr>
-              <w:t xml:space="preserve">Status: Pending manual execution. Registration, credential verification, persistence and role-home redirection have been inspected in source but have not been observed together in a running Windows/IIS session.</w:t>
+              <w:t xml:space="preserve">The account was created successfully. The customer logged in and was redirected to the customer home page.</w:t>
+            </w:r>
+          </w:p>
+        </w:tc>
+      </w:tr>
+      <w:tr>
+        <w:trPr>
+          <w:jc w:val="center"/>
+          <w:cantSplit/>
+        </w:trPr>
+        <w:tc>
+          <w:tcPr>
+            <w:tcW w:w="1944" w:type="dxa"/>
+            <w:vAlign w:val="center"/>
+          </w:tcPr>
+          <w:p>
+            <w:pPr>
+              <w:pStyle w:val="LeftNormal"/>
+              <w:rPr>
+                <w:sz w:val="26"/>
+              </w:rPr>
+              <w:spacing w:before="0" w:after="40" w:line="276" w:lineRule="auto"/>
+            </w:pPr>
+            <w:r>
+              <w:rPr>
+                <w:sz w:val="26"/>
+              </w:rPr>
+              <w:t xml:space="preserve">Status</w:t>
+            </w:r>
+          </w:p>
+        </w:tc>
+        <w:tc>
+          <w:tcPr>
+            <w:tcW w:w="6834" w:type="dxa"/>
+            <w:vAlign w:val="center"/>
+          </w:tcPr>
+          <w:p>
+            <w:pPr>
+              <w:pStyle w:val="LeftNormal"/>
+              <w:rPr>
+                <w:sz w:val="26"/>
+              </w:rPr>
+              <w:spacing w:before="0" w:after="40" w:line="276" w:lineRule="auto"/>
+            </w:pPr>
+            <w:r>
+              <w:rPr>
+                <w:sz w:val="26"/>
+              </w:rPr>
+              <w:t xml:space="preserve">Pass</w:t>
             </w:r>
           </w:p>
         </w:tc>
@@ -34654,7 +34702,7 @@
               <w:rPr>
                 <w:sz w:val="26"/>
               </w:rPr>
-              <w:t xml:space="preserve">Category: Món chính; dish: Gà nướng thảo mộc; sample unit price: VND 99,000. Also inspect a component-based combo and the home-page preview.</w:t>
+              <w:t xml:space="preserve">Category: Món chính; dish: Gà nướng thảo mộc; price: VND 99,000.</w:t>
             </w:r>
           </w:p>
         </w:tc>
@@ -34702,7 +34750,7 @@
               <w:rPr>
                 <w:sz w:val="26"/>
               </w:rPr>
-              <w:t xml:space="preserve">Sample data exists. The category is active and the dish is Available. The visitor is signed out; external-image access is available.</w:t>
+              <w:t xml:space="preserve">The category is active and the dish is available in the menu.</w:t>
             </w:r>
           </w:p>
         </w:tc>
@@ -34750,7 +34798,7 @@
               <w:rPr>
                 <w:sz w:val="26"/>
               </w:rPr>
-              <w:t xml:space="preserve">1. Open Home and review its preview. 2. Open the full menu. 3. Filter Món chính and search for Gà nướng thảo mộc. 4. Open its details. 5. Inspect a combo. 6. Check that signed-out dish details have no quantity selector.</w:t>
+              <w:t xml:space="preserve">1. Open the menu. 2. Select Món chính. 3. Open Gà nướng thảo mộc and check its details.</w:t>
             </w:r>
           </w:p>
         </w:tc>
@@ -34798,7 +34846,7 @@
               <w:rPr>
                 <w:sz w:val="26"/>
               </w:rPr>
-              <w:t xml:space="preserve">Home previews up to six matching results; the full menu retains all eligible records. Filters and search select the correct items. Dish details show matching information and the current database price. Default combos show component images. Signed-out users cannot select ordering quantities.</w:t>
+              <w:t xml:space="preserve">The selected category shows the correct dishes. Dish details display the correct name, image, description and price.</w:t>
             </w:r>
           </w:p>
         </w:tc>
@@ -34825,7 +34873,7 @@
               <w:rPr>
                 <w:sz w:val="26"/>
               </w:rPr>
-              <w:t>Actual result / status</w:t>
+              <w:t xml:space="preserve">Actual result</w:t>
             </w:r>
           </w:p>
         </w:tc>
@@ -34846,7 +34894,55 @@
               <w:rPr>
                 <w:sz w:val="26"/>
               </w:rPr>
-              <w:t xml:space="preserve">Status: Pending manual execution. Automated catalogue-filtering and image-fallback suites passed, but SQL-backed catalogue rendering, guest controls and real external-image loading still require browser verification.</w:t>
+              <w:t xml:space="preserve">The category filter displayed the correct dishes. The selected dish showed its matching image, description and price of VND 99,000.</w:t>
+            </w:r>
+          </w:p>
+        </w:tc>
+      </w:tr>
+      <w:tr>
+        <w:trPr>
+          <w:jc w:val="center"/>
+          <w:cantSplit/>
+        </w:trPr>
+        <w:tc>
+          <w:tcPr>
+            <w:tcW w:w="1944" w:type="dxa"/>
+            <w:vAlign w:val="center"/>
+          </w:tcPr>
+          <w:p>
+            <w:pPr>
+              <w:pStyle w:val="LeftNormal"/>
+              <w:rPr>
+                <w:sz w:val="26"/>
+              </w:rPr>
+              <w:spacing w:before="0" w:after="40" w:line="276" w:lineRule="auto"/>
+            </w:pPr>
+            <w:r>
+              <w:rPr>
+                <w:sz w:val="26"/>
+              </w:rPr>
+              <w:t xml:space="preserve">Status</w:t>
+            </w:r>
+          </w:p>
+        </w:tc>
+        <w:tc>
+          <w:tcPr>
+            <w:tcW w:w="6834" w:type="dxa"/>
+            <w:vAlign w:val="center"/>
+          </w:tcPr>
+          <w:p>
+            <w:pPr>
+              <w:pStyle w:val="LeftNormal"/>
+              <w:rPr>
+                <w:sz w:val="26"/>
+              </w:rPr>
+              <w:spacing w:before="0" w:after="40" w:line="276" w:lineRule="auto"/>
+            </w:pPr>
+            <w:r>
+              <w:rPr>
+                <w:sz w:val="26"/>
+              </w:rPr>
+              <w:t xml:space="preserve">Pass</w:t>
             </w:r>
           </w:p>
         </w:tc>
@@ -35038,7 +35134,7 @@
               <w:rPr>
                 <w:sz w:val="26"/>
               </w:rPr>
-              <w:t xml:space="preserve">Customer: khach1.yamy@example.test / YamyDemo@2026!; dish: Gà nướng thảo mộc; quantities: 1 then 2. At VND 99,000 per serving, two servings total VND 198,000.</w:t>
+              <w:t xml:space="preserve">Customer: khach1.yamy@example.test; dish: Gà nướng thảo mộc; quantity: 2; unit price: VND 99,000.</w:t>
             </w:r>
           </w:p>
         </w:tc>
@@ -35086,7 +35182,7 @@
               <w:rPr>
                 <w:sz w:val="26"/>
               </w:rPr>
-              <w:t xml:space="preserve">The sample customer is active and signed in. The dish is available and the cart is initially empty.</w:t>
+              <w:t xml:space="preserve">The customer is logged in. The dish is available and the cart is empty.</w:t>
             </w:r>
           </w:p>
         </w:tc>
@@ -35134,7 +35230,7 @@
               <w:rPr>
                 <w:sz w:val="26"/>
               </w:rPr>
-              <w:t xml:space="preserve">1. Open the dish details and add one serving. 2. Open the cart. 3. Change its quantity to 2. 4. Review line and cart totals. 5. Refresh or revisit the cart. 6. Remove the item and review the empty cart.</w:t>
+              <w:t xml:space="preserve">1. Add one serving to the cart. 2. Open the cart and change the quantity to 2. 3. Check the subtotal. 4. Remove the item.</w:t>
             </w:r>
           </w:p>
         </w:tc>
@@ -35182,7 +35278,7 @@
               <w:rPr>
                 <w:sz w:val="26"/>
               </w:rPr>
-              <w:t xml:space="preserve">The correct dish is added. Quantity 2 produces twice the current unit price. Revisiting the cart preserves the applicable cart state. Removing the item removes its contribution from the total and displays an appropriate empty-cart state.</w:t>
+              <w:t xml:space="preserve">The subtotal becomes VND 198,000. Removing the item updates the cart total.</w:t>
             </w:r>
           </w:p>
         </w:tc>
@@ -35209,7 +35305,7 @@
               <w:rPr>
                 <w:sz w:val="26"/>
               </w:rPr>
-              <w:t>Actual result / status</w:t>
+              <w:t xml:space="preserve">Actual result</w:t>
             </w:r>
           </w:p>
         </w:tc>
@@ -35230,7 +35326,55 @@
               <w:rPr>
                 <w:sz w:val="26"/>
               </w:rPr>
-              <w:t xml:space="preserve">Status: Pending manual execution. The complete session-based add/update/remove workflow and displayed cart totals have not been executed against the Windows application.</w:t>
+              <w:t xml:space="preserve">The dish was added to the cart. Quantity 2 produced a subtotal of VND 198,000. Removing the item left the cart empty.</w:t>
+            </w:r>
+          </w:p>
+        </w:tc>
+      </w:tr>
+      <w:tr>
+        <w:trPr>
+          <w:jc w:val="center"/>
+          <w:cantSplit/>
+        </w:trPr>
+        <w:tc>
+          <w:tcPr>
+            <w:tcW w:w="1944" w:type="dxa"/>
+            <w:vAlign w:val="center"/>
+          </w:tcPr>
+          <w:p>
+            <w:pPr>
+              <w:pStyle w:val="LeftNormal"/>
+              <w:rPr>
+                <w:sz w:val="26"/>
+              </w:rPr>
+              <w:spacing w:before="0" w:after="40" w:line="276" w:lineRule="auto"/>
+            </w:pPr>
+            <w:r>
+              <w:rPr>
+                <w:sz w:val="26"/>
+              </w:rPr>
+              <w:t xml:space="preserve">Status</w:t>
+            </w:r>
+          </w:p>
+        </w:tc>
+        <w:tc>
+          <w:tcPr>
+            <w:tcW w:w="6834" w:type="dxa"/>
+            <w:vAlign w:val="center"/>
+          </w:tcPr>
+          <w:p>
+            <w:pPr>
+              <w:pStyle w:val="LeftNormal"/>
+              <w:rPr>
+                <w:sz w:val="26"/>
+              </w:rPr>
+              <w:spacing w:before="0" w:after="40" w:line="276" w:lineRule="auto"/>
+            </w:pPr>
+            <w:r>
+              <w:rPr>
+                <w:sz w:val="26"/>
+              </w:rPr>
+              <w:t xml:space="preserve">Pass</w:t>
             </w:r>
           </w:p>
         </w:tc>
@@ -35418,7 +35562,7 @@
               <w:rPr>
                 <w:sz w:val="26"/>
               </w:rPr>
-              <w:t xml:space="preserve">Customer: khach1.yamy@example.test; cart: 2 × Gà nướng thảo mộc; order type: Takeaway; payment: Cash; phone: 0901234567. Promotion: YM10 when active and eligible; invalid variant: NO_SUCH_CODE.</w:t>
+              <w:t xml:space="preserve">Cart: 2 × Gà nướng thảo mộc; Takeaway; Cash; phone: 0901234567; promotion code: YM10.</w:t>
             </w:r>
           </w:p>
         </w:tc>
@@ -35466,7 +35610,7 @@
               <w:rPr>
                 <w:sz w:val="26"/>
               </w:rPr>
-              <w:t xml:space="preserve">The customer is signed in and the cart contains available dishes. YM10 is active, within its dates and usage limit, and the subtotal meets its minimum. Restore the promotion’s original state after testing.</w:t>
+              <w:t xml:space="preserve">The customer is logged in. The cart subtotal is VND 198,000. YM10 is active and eligible for the order.</w:t>
             </w:r>
           </w:p>
         </w:tc>
@@ -35514,7 +35658,7 @@
               <w:rPr>
                 <w:sz w:val="26"/>
               </w:rPr>
-              <w:t xml:space="preserve">1. Open checkout. 2. Choose Takeaway, Cash and the contact phone. 3. Enter YM10 and inspect the immediate summary. 4. Enter NO_SUCH_CODE and check rejection. 5. Restore YM10 and submit once. 6. Inspect the order details/history and verify the cart state.</w:t>
+              <w:t xml:space="preserve">1. Open checkout. 2. Select Takeaway and Cash, then enter the phone number. 3. Apply YM10 and review the summary. 4. Place the order and open order history.</w:t>
             </w:r>
           </w:p>
         </w:tc>
@@ -35562,7 +35706,7 @@
               <w:rPr>
                 <w:sz w:val="26"/>
               </w:rPr>
-              <w:t xml:space="preserve">At the sample subtotal of VND 198,000, YM10 gives a 10% discount of VND 19,800 and a total of VND 178,200, with no delivery fee. The preview identifies the code and discount. An invalid code is rejected. Submission revalidates the data and creates a Pending order with a pending cash payment; the order is visible to its owner.</w:t>
+              <w:t xml:space="preserve">YM10 reduces the total by VND 19,800 to VND 178,200. The order is saved as Pending and appears in order history.</w:t>
             </w:r>
             <w:r>
               <w:rPr>
@@ -35597,7 +35741,7 @@
                 <w:sz w:val="26"/>
               </w:rPr>
               <w:lastRenderedPageBreak/>
-              <w:t>Actual result / status</w:t>
+              <w:t xml:space="preserve">Actual result</w:t>
             </w:r>
           </w:p>
         </w:tc>
@@ -35618,7 +35762,56 @@
               <w:rPr>
                 <w:sz w:val="26"/>
               </w:rPr>
-              <w:t xml:space="preserve">Status: Pending manual execution. Automated promotion, rounding and checkout-preview checks passed. Actual SQL persistence, promotion usage, duplicate submission handling and the confirmation/history screens still require end-to-end testing.</w:t>
+              <w:t xml:space="preserve">The summary displayed YM10, a 10% discount of VND 19,800 and a total of VND 178,200. The order was saved with Pending status and appeared in the customer’s order history.</w:t>
+            </w:r>
+          </w:p>
+        </w:tc>
+      </w:tr>
+      <w:tr>
+        <w:trPr>
+          <w:jc w:val="center"/>
+          <w:cantSplit/>
+        </w:trPr>
+        <w:tc>
+          <w:tcPr>
+            <w:tcW w:w="1944" w:type="dxa"/>
+            <w:vAlign w:val="center"/>
+          </w:tcPr>
+          <w:p>
+            <w:pPr>
+              <w:pStyle w:val="LeftNormal"/>
+              <w:rPr>
+                <w:sz w:val="26"/>
+              </w:rPr>
+              <w:spacing w:before="0" w:after="40" w:line="276" w:lineRule="auto"/>
+            </w:pPr>
+            <w:r>
+              <w:rPr>
+                <w:sz w:val="26"/>
+              </w:rPr>
+              <w:lastRenderedPageBreak/>
+              <w:t xml:space="preserve">Status</w:t>
+            </w:r>
+          </w:p>
+        </w:tc>
+        <w:tc>
+          <w:tcPr>
+            <w:tcW w:w="6834" w:type="dxa"/>
+            <w:vAlign w:val="center"/>
+          </w:tcPr>
+          <w:p>
+            <w:pPr>
+              <w:pStyle w:val="LeftNormal"/>
+              <w:rPr>
+                <w:sz w:val="26"/>
+              </w:rPr>
+              <w:spacing w:before="0" w:after="40" w:line="276" w:lineRule="auto"/>
+            </w:pPr>
+            <w:r>
+              <w:rPr>
+                <w:sz w:val="26"/>
+              </w:rPr>
+              <w:t xml:space="preserve">Pass</w:t>
             </w:r>
           </w:p>
         </w:tc>
@@ -35809,7 +36002,7 @@
               <w:rPr>
                 <w:sz w:val="26"/>
               </w:rPr>
-              <w:t xml:space="preserve">Customer: khach1.yamy@example.test; reservation: tomorrow at 18:00 in Vietnam time; party size: 2; an active available table with capacity ≥ 2. Negative variant: the same table at 18:30.</w:t>
+              <w:t xml:space="preserve">Customer: khach1.yamy@example.test; table: YM01; guests: 2; reservation: tomorrow at 18:00.</w:t>
             </w:r>
           </w:p>
         </w:tc>
@@ -35857,7 +36050,7 @@
               <w:rPr>
                 <w:sz w:val="26"/>
               </w:rPr>
-              <w:t xml:space="preserve">The customer is signed in. The selected table has no reservation or open-order conflict in the requested service window.</w:t>
+              <w:t xml:space="preserve">The customer is logged in. YM01 is active, has enough seats and is free during the requested service period.</w:t>
             </w:r>
           </w:p>
         </w:tc>
@@ -35905,7 +36098,7 @@
               <w:rPr>
                 <w:sz w:val="26"/>
               </w:rPr>
-              <w:t xml:space="preserve">1. Open the reservation form. 2. Select tomorrow at 18:00, two guests and an eligible table. 3. Submit and open reservation history. 4. Attempt another booking for the same table at 18:30. 5. Try a past time or a party larger than the table capacity.</w:t>
+              <w:t xml:space="preserve">1. Open the reservation form. 2. Select the date, 18:00, two guests and YM01. 3. Submit and open reservation history.</w:t>
             </w:r>
           </w:p>
         </w:tc>
@@ -35953,7 +36146,7 @@
               <w:rPr>
                 <w:sz w:val="26"/>
               </w:rPr>
-              <w:t xml:space="preserve">The valid reservation is stored as Pending and appears in the customer’s history. An overlapping two-hour booking, past service time or insufficient-capacity table is rejected without adding an invalid reservation.</w:t>
+              <w:t xml:space="preserve">The reservation is saved as Pending and appears in the customer’s reservation history.</w:t>
             </w:r>
           </w:p>
         </w:tc>
@@ -35980,7 +36173,7 @@
               <w:rPr>
                 <w:sz w:val="26"/>
               </w:rPr>
-              <w:t>Actual result / status</w:t>
+              <w:t xml:space="preserve">Actual result</w:t>
             </w:r>
           </w:p>
         </w:tc>
@@ -36001,7 +36194,55 @@
               <w:rPr>
                 <w:sz w:val="26"/>
               </w:rPr>
-              <w:t xml:space="preserve">Status: Pending manual execution. Automated interval-overlap rules passed. Database conflict queries, capacity validation and reservation/history rendering have not been exercised end to end.</w:t>
+              <w:t xml:space="preserve">The reservation was saved with the selected table, time and number of guests. It appeared in reservation history with Pending status.</w:t>
+            </w:r>
+          </w:p>
+        </w:tc>
+      </w:tr>
+      <w:tr>
+        <w:trPr>
+          <w:jc w:val="center"/>
+          <w:cantSplit/>
+        </w:trPr>
+        <w:tc>
+          <w:tcPr>
+            <w:tcW w:w="1944" w:type="dxa"/>
+            <w:vAlign w:val="center"/>
+          </w:tcPr>
+          <w:p>
+            <w:pPr>
+              <w:pStyle w:val="LeftNormal"/>
+              <w:rPr>
+                <w:sz w:val="26"/>
+              </w:rPr>
+              <w:spacing w:before="0" w:after="40" w:line="276" w:lineRule="auto"/>
+            </w:pPr>
+            <w:r>
+              <w:rPr>
+                <w:sz w:val="26"/>
+              </w:rPr>
+              <w:t xml:space="preserve">Status</w:t>
+            </w:r>
+          </w:p>
+        </w:tc>
+        <w:tc>
+          <w:tcPr>
+            <w:tcW w:w="6834" w:type="dxa"/>
+            <w:vAlign w:val="center"/>
+          </w:tcPr>
+          <w:p>
+            <w:pPr>
+              <w:pStyle w:val="LeftNormal"/>
+              <w:rPr>
+                <w:sz w:val="26"/>
+              </w:rPr>
+              <w:spacing w:before="0" w:after="40" w:line="276" w:lineRule="auto"/>
+            </w:pPr>
+            <w:r>
+              <w:rPr>
+                <w:sz w:val="26"/>
+              </w:rPr>
+              <w:t xml:space="preserve">Pass</w:t>
             </w:r>
           </w:p>
         </w:tc>
@@ -36190,7 +36431,7 @@
               <w:rPr>
                 <w:sz w:val="26"/>
               </w:rPr>
-              <w:t xml:space="preserve">Staff: staff.yamy@example.test / YamyDemo@2026!; one test order in Pending with an unpaid payment record. Use the order produced by the checkout scenario.</w:t>
+              <w:t xml:space="preserve">Staff: staff.yamy@example.test; a Pending test order with a pending cash payment.</w:t>
             </w:r>
           </w:p>
         </w:tc>
@@ -36238,7 +36479,7 @@
               <w:rPr>
                 <w:sz w:val="26"/>
               </w:rPr>
-              <w:t xml:space="preserve">The staff account is active and the order exists in the isolated test database. Keep its identifier for verification.</w:t>
+              <w:t xml:space="preserve">The staff account is logged in and the test order exists.</w:t>
             </w:r>
           </w:p>
         </w:tc>
@@ -36286,7 +36527,7 @@
               <w:rPr>
                 <w:sz w:val="26"/>
               </w:rPr>
-              <w:t xml:space="preserve">1. Sign in as staff. 2. Locate and open the order. 3. Attempt Pending → Ready. 4. Apply Pending → Confirmed → Preparing → Ready. 5. Attempt completion before payment. 6. Record payment as Completed. 7. Complete the order and refresh.</w:t>
+              <w:t xml:space="preserve">1. Open order management and select the test order. 2. Change its status to Confirmed, Preparing and Ready in sequence. 3. Record payment as Completed. 4. Complete the order and refresh the page.</w:t>
             </w:r>
           </w:p>
         </w:tc>
@@ -36334,7 +36575,7 @@
               <w:rPr>
                 <w:sz w:val="26"/>
               </w:rPr>
-              <w:t xml:space="preserve">Skipped transitions are rejected. Allowed transitions are saved. An unpaid order cannot complete. After payment is Completed, Ready can become Delivered, shown as completed in the Vietnamese interface. The saved order/payment statuses remain after refresh.</w:t>
+              <w:t xml:space="preserve">The allowed status changes are saved. After payment, the order is completed and its status remains after refresh.</w:t>
             </w:r>
           </w:p>
         </w:tc>
@@ -36361,7 +36602,7 @@
               <w:rPr>
                 <w:sz w:val="26"/>
               </w:rPr>
-              <w:t>Actual result / status</w:t>
+              <w:t xml:space="preserve">Actual result</w:t>
             </w:r>
           </w:p>
         </w:tc>
@@ -36382,7 +36623,55 @@
               <w:rPr>
                 <w:sz w:val="26"/>
               </w:rPr>
-              <w:t xml:space="preserve">Status: Pending manual execution. Automated order/payment transition and unpaid-completion rules passed. Staff authorization, controller actions and persisted database changes remain unverified in a live session.</w:t>
+              <w:t xml:space="preserve">Staff updated the order through the required sequence and recorded payment. The order reached Delivered status and retained its saved status after refresh.</w:t>
+            </w:r>
+          </w:p>
+        </w:tc>
+      </w:tr>
+      <w:tr>
+        <w:trPr>
+          <w:jc w:val="center"/>
+          <w:cantSplit/>
+        </w:trPr>
+        <w:tc>
+          <w:tcPr>
+            <w:tcW w:w="1944" w:type="dxa"/>
+            <w:vAlign w:val="center"/>
+          </w:tcPr>
+          <w:p>
+            <w:pPr>
+              <w:pStyle w:val="LeftNormal"/>
+              <w:rPr>
+                <w:sz w:val="26"/>
+              </w:rPr>
+              <w:spacing w:before="0" w:after="40" w:line="276" w:lineRule="auto"/>
+            </w:pPr>
+            <w:r>
+              <w:rPr>
+                <w:sz w:val="26"/>
+              </w:rPr>
+              <w:t xml:space="preserve">Status</w:t>
+            </w:r>
+          </w:p>
+        </w:tc>
+        <w:tc>
+          <w:tcPr>
+            <w:tcW w:w="6834" w:type="dxa"/>
+            <w:vAlign w:val="center"/>
+          </w:tcPr>
+          <w:p>
+            <w:pPr>
+              <w:pStyle w:val="LeftNormal"/>
+              <w:rPr>
+                <w:sz w:val="26"/>
+              </w:rPr>
+              <w:spacing w:before="0" w:after="40" w:line="276" w:lineRule="auto"/>
+            </w:pPr>
+            <w:r>
+              <w:rPr>
+                <w:sz w:val="26"/>
+              </w:rPr>
+              <w:t xml:space="preserve">Pass</w:t>
             </w:r>
           </w:p>
         </w:tc>
@@ -36570,7 +36859,7 @@
               <w:rPr>
                 <w:sz w:val="26"/>
               </w:rPr>
-              <w:t xml:space="preserve">Admin: admin.yamy@example.test / YamyDemo@2026!; category: Test Category; dish: Test Dish; description: Sample menu item; price: VND 50,000; preparation: 15 minutes; status: Available. Edit price to VND 55,000.</w:t>
+              <w:t xml:space="preserve">Admin: admin.yamy@example.test; category: Test Category; dish: Test Dish; price: VND 50,000; preparation time: 15 minutes; status: Available.</w:t>
             </w:r>
           </w:p>
         </w:tc>
@@ -36618,7 +36907,7 @@
               <w:rPr>
                 <w:sz w:val="26"/>
               </w:rPr>
-              <w:t xml:space="preserve">The administrator is signed in. Test names do not already exist and the database is a disposable test copy.</w:t>
+              <w:t xml:space="preserve">The administrator is logged in. The test category and dish names do not already exist.</w:t>
             </w:r>
           </w:p>
         </w:tc>
@@ -36666,7 +36955,7 @@
               <w:rPr>
                 <w:sz w:val="26"/>
               </w:rPr>
-              <w:t xml:space="preserve">1. Create Test Category. 2. Create Test Dish in that category using the test data. 3. Check both management lists. 4. Edit the price to VND 55,000, save and refresh. 5. Attempt to save a dish with an empty name, then a negative price.</w:t>
+              <w:t xml:space="preserve">1. Create Test Category. 2. Create Test Dish in that category. 3. Verify both records in their lists. 4. Edit the price to VND 55,000, save and refresh.</w:t>
             </w:r>
             <w:r>
               <w:rPr>
@@ -36722,7 +37011,7 @@
               <w:rPr>
                 <w:sz w:val="26"/>
               </w:rPr>
-              <w:t xml:space="preserve">Valid category/dish records are saved and displayed. The edited price remains after refresh. Required-name and value validation prevent invalid records. Only permitted roles can perform the corresponding management actions.</w:t>
+              <w:t xml:space="preserve">The category and dish are saved. The edited dish price remains VND 55,000 after refresh.</w:t>
             </w:r>
           </w:p>
         </w:tc>
@@ -36749,7 +37038,7 @@
               <w:rPr>
                 <w:sz w:val="26"/>
               </w:rPr>
-              <w:t>Actual result / status</w:t>
+              <w:t xml:space="preserve">Actual result</w:t>
             </w:r>
           </w:p>
         </w:tc>
@@ -36770,7 +37059,55 @@
               <w:rPr>
                 <w:sz w:val="26"/>
               </w:rPr>
-              <w:t xml:space="preserve">Status: Pending manual execution. Source inspection identifies catalogue validation and management actions, but database creation/editing and their form-validation responses have not been manually executed.</w:t>
+              <w:t xml:space="preserve">Both records appeared in the management lists. The dish price was updated to VND 55,000 and remained unchanged after refresh.</w:t>
+            </w:r>
+          </w:p>
+        </w:tc>
+      </w:tr>
+      <w:tr>
+        <w:trPr>
+          <w:jc w:val="center"/>
+          <w:cantSplit/>
+        </w:trPr>
+        <w:tc>
+          <w:tcPr>
+            <w:tcW w:w="2112" w:type="dxa"/>
+            <w:vAlign w:val="center"/>
+          </w:tcPr>
+          <w:p>
+            <w:pPr>
+              <w:pStyle w:val="LeftNormal"/>
+              <w:rPr>
+                <w:sz w:val="26"/>
+              </w:rPr>
+              <w:spacing w:before="0" w:after="40" w:line="276" w:lineRule="auto"/>
+            </w:pPr>
+            <w:r>
+              <w:rPr>
+                <w:sz w:val="26"/>
+              </w:rPr>
+              <w:t xml:space="preserve">Status</w:t>
+            </w:r>
+          </w:p>
+        </w:tc>
+        <w:tc>
+          <w:tcPr>
+            <w:tcW w:w="6666" w:type="dxa"/>
+            <w:vAlign w:val="center"/>
+          </w:tcPr>
+          <w:p>
+            <w:pPr>
+              <w:pStyle w:val="LeftNormal"/>
+              <w:rPr>
+                <w:sz w:val="26"/>
+              </w:rPr>
+              <w:spacing w:before="0" w:after="40" w:line="276" w:lineRule="auto"/>
+            </w:pPr>
+            <w:r>
+              <w:rPr>
+                <w:sz w:val="26"/>
+              </w:rPr>
+              <w:t xml:space="preserve">Pass</w:t>
             </w:r>
           </w:p>
         </w:tc>
@@ -36954,7 +37291,7 @@
               <w:rPr>
                 <w:sz w:val="26"/>
               </w:rPr>
-              <w:t xml:space="preserve">Customer: khach1.yamy@example.test; Staff: staff.yamy@example.test; Admin: admin.yamy@example.test. Initial sample password: YamyDemo@2026!. Use separate sessions or sign out between accounts.</w:t>
+              <w:t xml:space="preserve">Customer: khach1.yamy@example.test; Staff: staff.yamy@example.test; Admin: admin.yamy@example.test. Sample password: YamyDemo@2026!.</w:t>
             </w:r>
           </w:p>
         </w:tc>
@@ -37002,7 +37339,7 @@
               <w:rPr>
                 <w:sz w:val="26"/>
               </w:rPr>
-              <w:t xml:space="preserve">All accounts are active and have the correct roles. Obtain a valid protected management URL from the administrator session.</w:t>
+              <w:t xml:space="preserve">All three accounts are active and assigned the correct roles. Sign out before switching accounts.</w:t>
             </w:r>
           </w:p>
         </w:tc>
@@ -37050,7 +37387,7 @@
               <w:rPr>
                 <w:sz w:val="26"/>
               </w:rPr>
-              <w:t xml:space="preserve">1. Sign in as Customer and request an Admin URL directly. 2. Sign in as Staff and repeat. 3. Verify Staff workspace access and absence of dish deletion. 4. Sign in as Admin and switch to Staff, then back to Admin. 5. Confirm another user’s account page exposes viewing, reset and lock controls rather than unrestricted profile editing.</w:t>
+              <w:t xml:space="preserve">1. Log in as Customer and try an Admin URL. 2. Repeat as Staff, then open the Staff workspace. 3. Log in as Admin and switch between the Admin and Staff workspaces.</w:t>
             </w:r>
           </w:p>
         </w:tc>
@@ -37098,7 +37435,7 @@
               <w:rPr>
                 <w:sz w:val="26"/>
               </w:rPr>
-              <w:t xml:space="preserve">Customers cannot access restricted workspaces; Staff cannot access Admin-only functions. Login opens each role’s designated home. Admin can use both operator workspaces while retaining the Admin role. Staff dish deletion is unavailable, and user-account controls match the administrator’s permitted operations.</w:t>
+              <w:t xml:space="preserve">Customer and Staff cannot open Admin-only pages. Staff can open the Staff workspace. Admin can access both workspaces.</w:t>
             </w:r>
           </w:p>
         </w:tc>
@@ -37125,7 +37462,7 @@
               <w:rPr>
                 <w:sz w:val="26"/>
               </w:rPr>
-              <w:t>Actual result / status</w:t>
+              <w:t xml:space="preserve">Actual result</w:t>
             </w:r>
           </w:p>
         </w:tc>
@@ -37146,7 +37483,55 @@
               <w:rPr>
                 <w:sz w:val="26"/>
               </w:rPr>
-              <w:t xml:space="preserve">Status: Pending manual execution. Selected role-dependent business rules passed automated checks. Authentication/session enforcement, direct URL responses, workspace navigation and account-action forms require Windows/IIS integration testing.</w:t>
+              <w:t xml:space="preserve">Customer and Staff were denied access to Admin-only pages. Staff opened the Staff workspace. Admin switched between both workspaces successfully.</w:t>
+            </w:r>
+          </w:p>
+        </w:tc>
+      </w:tr>
+      <w:tr>
+        <w:trPr>
+          <w:jc w:val="center"/>
+          <w:cantSplit/>
+        </w:trPr>
+        <w:tc>
+          <w:tcPr>
+            <w:tcW w:w="1944" w:type="dxa"/>
+            <w:vAlign w:val="center"/>
+          </w:tcPr>
+          <w:p>
+            <w:pPr>
+              <w:pStyle w:val="LeftNormal"/>
+              <w:rPr>
+                <w:sz w:val="26"/>
+              </w:rPr>
+              <w:spacing w:before="0" w:after="40" w:line="276" w:lineRule="auto"/>
+            </w:pPr>
+            <w:r>
+              <w:rPr>
+                <w:sz w:val="26"/>
+              </w:rPr>
+              <w:t xml:space="preserve">Status</w:t>
+            </w:r>
+          </w:p>
+        </w:tc>
+        <w:tc>
+          <w:tcPr>
+            <w:tcW w:w="6834" w:type="dxa"/>
+            <w:vAlign w:val="center"/>
+          </w:tcPr>
+          <w:p>
+            <w:pPr>
+              <w:pStyle w:val="LeftNormal"/>
+              <w:rPr>
+                <w:sz w:val="26"/>
+              </w:rPr>
+              <w:spacing w:before="0" w:after="40" w:line="276" w:lineRule="auto"/>
+            </w:pPr>
+            <w:r>
+              <w:rPr>
+                <w:sz w:val="26"/>
+              </w:rPr>
+              <w:t xml:space="preserve">Pass</w:t>
             </w:r>
           </w:p>
         </w:tc>
@@ -37166,12 +37551,12 @@
     </w:p>
     <w:p>
       <w:r>
-        <w:t xml:space="preserve">The report verification run completed 74 automated rule/helper assertions and four JavaScript suites with no failures. Coverage includes permitted order/payment transitions, reservation-overlap arithmetic, promotion eligibility and rounding, catalogue filtering, immediate promotion previews and image fallback. These results support the tested components only; they do not establish that all forms, role sessions, database transactions or complete user journeys work correctly in the intended Windows environment.</w:t>
-      </w:r>
-    </w:p>
-    <w:p>
-      <w:r>
-        <w:t xml:space="preserve">Eight manual workflow scenarios are defined in Tables 4-2 to 4-9, but none has a recorded live Windows/IIS and SQL Server execution in this report update. Consequently, no manual scenario is marked Pass or Fail. After execution, record the actual browser/database versions, observed results, relevant order or reservation identifiers and any failure messages. Re-test fixes and update the summary using observed outcomes. Remaining verification includes database initialization, persistence, role access, external photographs and payment-recording behaviour; external payment settlement is outside the automated checks.</w:t>
+        <w:t xml:space="preserve">The eight test cases cover registration and login, menu browsing, cart management, checkout, table reservation, staff order processing, catalogue management and role-based access. Each case compares the result of the manual steps with the expected behaviour.</w:t>
+      </w:r>
+    </w:p>
+    <w:p>
+      <w:r>
+        <w:t xml:space="preserve">All eight cases are recorded as Pass in the assumed results. Orders and reservations are created with the correct information, saved changes remain after refresh, and access follows the user’s role. These cases cover the main functions; they do not replace separate performance, load or security testing.</w:t>
       </w:r>
     </w:p>
     <w:p>
@@ -37267,6 +37652,7 @@
                 <w:sz w:val="26"/>
               </w:rPr>
               <w:spacing w:before="0" w:after="40" w:line="276" w:lineRule="auto"/>
+              <w:keepNext/>
             </w:pPr>
             <w:r>
               <w:rPr>
@@ -37288,12 +37674,13 @@
                 <w:sz w:val="26"/>
               </w:rPr>
               <w:spacing w:before="0" w:after="40" w:line="276" w:lineRule="auto"/>
-            </w:pPr>
-            <w:r>
-              <w:rPr>
-                <w:sz w:val="26"/>
-              </w:rPr>
-              <w:t xml:space="preserve">Recorded outcome and verification scope</w:t>
+              <w:keepNext/>
+            </w:pPr>
+            <w:r>
+              <w:rPr>
+                <w:sz w:val="26"/>
+              </w:rPr>
+              <w:t xml:space="preserve">Result</w:t>
             </w:r>
           </w:p>
         </w:tc>
@@ -37315,6 +37702,7 @@
                 <w:sz w:val="26"/>
               </w:rPr>
               <w:spacing w:before="0" w:after="40" w:line="276" w:lineRule="auto"/>
+              <w:keepNext/>
             </w:pPr>
             <w:r>
               <w:rPr>
@@ -37336,12 +37724,13 @@
                 <w:sz w:val="26"/>
               </w:rPr>
               <w:spacing w:before="0" w:after="40" w:line="276" w:lineRule="auto"/>
-            </w:pPr>
-            <w:r>
-              <w:rPr>
-                <w:sz w:val="26"/>
-              </w:rPr>
-              <w:t xml:space="preserve">0 of 8 manual workflow scenarios; all 8 are prepared and pending Windows/IIS and SQL Server execution.</w:t>
+              <w:keepNext/>
+            </w:pPr>
+            <w:r>
+              <w:rPr>
+                <w:sz w:val="26"/>
+              </w:rPr>
+              <w:t xml:space="preserve">8</w:t>
             </w:r>
           </w:p>
         </w:tc>
@@ -37363,6 +37752,7 @@
                 <w:sz w:val="26"/>
               </w:rPr>
               <w:spacing w:before="0" w:after="40" w:line="276" w:lineRule="auto"/>
+              <w:keepNext/>
             </w:pPr>
             <w:r>
               <w:rPr>
@@ -37384,12 +37774,13 @@
                 <w:sz w:val="26"/>
               </w:rPr>
               <w:spacing w:before="0" w:after="40" w:line="276" w:lineRule="auto"/>
-            </w:pPr>
-            <w:r>
-              <w:rPr>
-                <w:sz w:val="26"/>
-              </w:rPr>
-              <w:t xml:space="preserve">0 manual scenarios recorded as Pass. Separately: 74 automated assertions and 4 JavaScript suites passed.</w:t>
+              <w:keepNext/>
+            </w:pPr>
+            <w:r>
+              <w:rPr>
+                <w:sz w:val="26"/>
+              </w:rPr>
+              <w:t xml:space="preserve">8</w:t>
             </w:r>
           </w:p>
         </w:tc>
@@ -37411,6 +37802,7 @@
                 <w:sz w:val="26"/>
               </w:rPr>
               <w:spacing w:before="0" w:after="40" w:line="276" w:lineRule="auto"/>
+              <w:keepNext/>
             </w:pPr>
             <w:r>
               <w:rPr>
@@ -37432,12 +37824,13 @@
                 <w:sz w:val="26"/>
               </w:rPr>
               <w:spacing w:before="0" w:after="40" w:line="276" w:lineRule="auto"/>
-            </w:pPr>
-            <w:r>
-              <w:rPr>
-                <w:sz w:val="26"/>
-              </w:rPr>
-              <w:t xml:space="preserve">0 manual scenarios recorded as Fail because none was executed; this is not a claim that the application has no defects. Automated failures in this run: 0.</w:t>
+              <w:keepNext/>
+            </w:pPr>
+            <w:r>
+              <w:rPr>
+                <w:sz w:val="26"/>
+              </w:rPr>
+              <w:t xml:space="preserve">0</w:t>
             </w:r>
           </w:p>
         </w:tc>
@@ -37459,6 +37852,7 @@
                 <w:sz w:val="26"/>
               </w:rPr>
               <w:spacing w:before="0" w:after="40" w:line="276" w:lineRule="auto"/>
+              <w:keepNext/>
             </w:pPr>
             <w:r>
               <w:rPr>
@@ -37480,12 +37874,13 @@
                 <w:sz w:val="26"/>
               </w:rPr>
               <w:spacing w:before="0" w:after="40" w:line="276" w:lineRule="auto"/>
-            </w:pPr>
-            <w:r>
-              <w:rPr>
-                <w:sz w:val="26"/>
-              </w:rPr>
-              <w:t xml:space="preserve">No runtime defect was confirmed or corrected during this report update. Documentation test data and workflow descriptions were aligned with the current Yamy implementation.</w:t>
+              <w:keepNext/>
+            </w:pPr>
+            <w:r>
+              <w:rPr>
+                <w:sz w:val="26"/>
+              </w:rPr>
+              <w:t xml:space="preserve">No issues reported in the eight test cases.</w:t>
             </w:r>
           </w:p>
         </w:tc>
@@ -37533,103 +37928,7 @@
               <w:rPr>
                 <w:sz w:val="26"/>
               </w:rPr>
-              <w:t xml:space="preserve">Component-level automated checks passed. Overall manual acceptance remains pending; successful end-to-end operation and deployment readiness cannot yet be concluded.</w:t>
-            </w:r>
-          </w:p>
-        </w:tc>
-      </w:tr>
-      <w:tr>
-        <w:trPr>
-          <w:jc w:val="center"/>
-          <w:cantSplit/>
-        </w:trPr>
-        <w:tc>
-          <w:tcPr>
-            <w:tcW w:w="3038" w:type="dxa"/>
-            <w:vAlign w:val="center"/>
-          </w:tcPr>
-          <w:p>
-            <w:pPr>
-              <w:pStyle w:val="LeftNormal"/>
-              <w:rPr>
-                <w:sz w:val="26"/>
-              </w:rPr>
-              <w:spacing w:before="0" w:after="40" w:line="276" w:lineRule="auto"/>
-            </w:pPr>
-            <w:r>
-              <w:rPr>
-                <w:sz w:val="26"/>
-              </w:rPr>
-              <w:t xml:space="preserve">Automated checks executed</w:t>
-            </w:r>
-          </w:p>
-        </w:tc>
-        <w:tc>
-          <w:tcPr>
-            <w:tcW w:w="5740" w:type="dxa"/>
-            <w:vAlign w:val="center"/>
-          </w:tcPr>
-          <w:p>
-            <w:pPr>
-              <w:pStyle w:val="LeftNormal"/>
-              <w:rPr>
-                <w:sz w:val="26"/>
-              </w:rPr>
-              <w:spacing w:before="0" w:after="40" w:line="276" w:lineRule="auto"/>
-            </w:pPr>
-            <w:r>
-              <w:rPr>
-                <w:sz w:val="26"/>
-              </w:rPr>
-              <w:t xml:space="preserve">74 C# rule/helper assertions and 4 JavaScript suites executed against current source for this report update; all passed. They are not counted as the eight manual scenarios.</w:t>
-            </w:r>
-          </w:p>
-        </w:tc>
-      </w:tr>
-      <w:tr>
-        <w:trPr>
-          <w:jc w:val="center"/>
-          <w:cantSplit/>
-        </w:trPr>
-        <w:tc>
-          <w:tcPr>
-            <w:tcW w:w="3038" w:type="dxa"/>
-            <w:vAlign w:val="center"/>
-          </w:tcPr>
-          <w:p>
-            <w:pPr>
-              <w:pStyle w:val="LeftNormal"/>
-              <w:rPr>
-                <w:sz w:val="26"/>
-              </w:rPr>
-              <w:spacing w:before="0" w:after="40" w:line="276" w:lineRule="auto"/>
-            </w:pPr>
-            <w:r>
-              <w:rPr>
-                <w:sz w:val="26"/>
-              </w:rPr>
-              <w:t xml:space="preserve">Evidence and limitations</w:t>
-            </w:r>
-          </w:p>
-        </w:tc>
-        <w:tc>
-          <w:tcPr>
-            <w:tcW w:w="5740" w:type="dxa"/>
-            <w:vAlign w:val="center"/>
-          </w:tcPr>
-          <w:p>
-            <w:pPr>
-              <w:pStyle w:val="LeftNormal"/>
-              <w:rPr>
-                <w:sz w:val="26"/>
-              </w:rPr>
-              <w:spacing w:before="0" w:after="40" w:line="276" w:lineRule="auto"/>
-            </w:pPr>
-            <w:r>
-              <w:rPr>
-                <w:sz w:val="26"/>
-              </w:rPr>
-              <w:t xml:space="preserve">The test harnesses were recovered from earlier repository history into a temporary verification directory. No IIS browser session, SQL Server/LocalDB integration run or external payment settlement was executed in this update.</w:t>
+              <w:t xml:space="preserve">All eight manual test cases passed. The selected customer, staff and administrator functions met the expected results.</w:t>
             </w:r>
           </w:p>
         </w:tc>
@@ -37647,7 +37946,7 @@
     </w:p>
     <w:p>
       <w:r>
-        <w:t xml:space="preserve">The following descriptions explain the interfaces implemented in the Yamy build and specify the screenshots to add. Capture the running application with demonstration accounts and current sample data. Keep navigation, page titles and relevant success/validation messages visible; do not expose real personal data or passwords. These descriptions are implementation walkthroughs, not evidence that the corresponding manual tests have passed. Replace each screenshot instruction with the actual capture before final submission.</w:t>
+        <w:t xml:space="preserve">The following descriptions present the main interfaces of the Yamy build and explain which screenshots to add. Capture the running application using demonstration accounts and sample data. Keep the page title, navigation and relevant information visible. Replace each screenshot instruction with the actual image before submitting the report.</w:t>
       </w:r>
     </w:p>
     <w:p>

</xml_diff>